<commit_message>
chore(template): publish refreshed public state
</commit_message>
<xml_diff>
--- a/output/templates/template_code_project/docx/templates/template_code_project_combined.docx
+++ b/output/templates/template_code_project/docx/templates/template_code_project_combined.docx
@@ -49,7 +49,7 @@
         <w:t xml:space="preserve"> </w:t>
       </w:r>
       <w:r>
-        <w:t xml:space="preserve">published</w:t>
+        <w:t xml:space="preserve">unpublished / pending pairing</w:t>
       </w:r>
     </w:p>
     <w:p>
@@ -67,7 +67,37 @@
         <w:t xml:space="preserve"> </w:t>
       </w:r>
       <w:r>
-        <w:t xml:space="preserve">complete (DOI, GitHub, SHA-256, Zenodo URL)</w:t>
+        <w:t xml:space="preserve">pending — unresolved:</w:t>
+      </w:r>
+      <w:r>
+        <w:t xml:space="preserve"> </w:t>
+      </w:r>
+      <w:r>
+        <w:t xml:space="preserve">- ✗ GitHub release URL:</w:t>
+      </w:r>
+      <w:r>
+        <w:t xml:space="preserve"> </w:t>
+      </w:r>
+      <w:r>
+        <w:rPr>
+          <w:rStyle w:val="VerbatimChar"/>
+        </w:rPr>
+        <w:t xml:space="preserve">pending</w:t>
+      </w:r>
+      <w:r>
+        <w:t xml:space="preserve"> </w:t>
+      </w:r>
+      <w:r>
+        <w:t xml:space="preserve">- ✗ PDF SHA-256:</w:t>
+      </w:r>
+      <w:r>
+        <w:t xml:space="preserve"> </w:t>
+      </w:r>
+      <w:r>
+        <w:rPr>
+          <w:rStyle w:val="VerbatimChar"/>
+        </w:rPr>
+        <w:t xml:space="preserve">pending</w:t>
       </w:r>
     </w:p>
     <w:tbl>
@@ -222,14 +252,9 @@
             <w:pPr>
               <w:pStyle w:val="Compact"/>
             </w:pPr>
-            <w:hyperlink r:id="rId9">
-              <w:r>
-                <w:rPr>
-                  <w:rStyle w:val="Hyperlink"/>
-                </w:rPr>
-                <w:t xml:space="preserve">https://github.com/docxology/template_code_project/releases/tag/v2.5.2</w:t>
-              </w:r>
-            </w:hyperlink>
+            <w:r>
+              <w:t xml:space="preserve">docxology/template_code_project</w:t>
+            </w:r>
           </w:p>
         </w:tc>
       </w:tr>
@@ -251,7 +276,7 @@
             <w:pPr>
               <w:pStyle w:val="Compact"/>
             </w:pPr>
-            <w:hyperlink r:id="rId10">
+            <w:hyperlink r:id="rId9">
               <w:r>
                 <w:rPr>
                   <w:rStyle w:val="Hyperlink"/>
@@ -281,10 +306,7 @@
               <w:pStyle w:val="Compact"/>
             </w:pPr>
             <w:r>
-              <w:rPr>
-                <w:rStyle w:val="VerbatimChar"/>
-              </w:rPr>
-              <w:t xml:space="preserve">cd54b95893501467…</w:t>
+              <w:t xml:space="preserve">pending</w:t>
             </w:r>
           </w:p>
         </w:tc>
@@ -419,18 +441,18 @@
           <wp:inline>
             <wp:extent cx="5227320" cy="1979653"/>
             <wp:effectExtent b="0" l="0" r="0" t="0"/>
-            <wp:docPr descr="Integrity QR strip" title="" id="12" name="Picture"/>
+            <wp:docPr descr="Integrity QR strip" title="" id="11" name="Picture"/>
             <a:graphic>
               <a:graphicData uri="http://schemas.openxmlformats.org/drawingml/2006/picture">
                 <pic:pic>
                   <pic:nvPicPr>
-                    <pic:cNvPr descr="../figures/transmission_integrity_strip.png" id="13" name="Picture"/>
+                    <pic:cNvPr descr="../figures/transmission_integrity_strip.png" id="12" name="Picture"/>
                     <pic:cNvPicPr>
                       <a:picLocks noChangeArrowheads="1" noChangeAspect="1"/>
                     </pic:cNvPicPr>
                   </pic:nvPicPr>
                   <pic:blipFill>
-                    <a:blip r:embed="rId11"/>
+                    <a:blip r:embed="rId10"/>
                     <a:stretch>
                       <a:fillRect/>
                     </a:stretch>
@@ -491,18 +513,18 @@
           <wp:inline>
             <wp:extent cx="1866900" cy="1066800"/>
             <wp:effectExtent b="0" l="0" r="0" t="0"/>
-            <wp:docPr descr="Publication pairing flow" title="" id="15" name="Picture"/>
+            <wp:docPr descr="Publication pairing flow" title="" id="14" name="Picture"/>
             <a:graphic>
               <a:graphicData uri="http://schemas.openxmlformats.org/drawingml/2006/picture">
                 <pic:pic>
                   <pic:nvPicPr>
-                    <pic:cNvPr descr="../figures/transmission_pairing.png" id="16" name="Picture"/>
+                    <pic:cNvPr descr="../figures/transmission_pairing.png" id="15" name="Picture"/>
                     <pic:cNvPicPr>
                       <a:picLocks noChangeArrowheads="1" noChangeAspect="1"/>
                     </pic:cNvPicPr>
                   </pic:nvPicPr>
                   <pic:blipFill>
-                    <a:blip r:embed="rId14"/>
+                    <a:blip r:embed="rId13"/>
                     <a:stretch>
                       <a:fillRect/>
                     </a:stretch>
@@ -564,7 +586,7 @@
         <w:t xml:space="preserve">./secure_run.sh</w:t>
       </w:r>
     </w:p>
-    <w:bookmarkStart w:id="19" w:name="sec:abstract"/>
+    <w:bookmarkStart w:id="18" w:name="sec:abstract"/>
     <w:p>
       <w:pPr>
         <w:pStyle w:val="Heading1"/>
@@ -599,7 +621,7 @@
       <w:r>
         <w:t xml:space="preserve"> </w:t>
       </w:r>
-      <w:hyperlink r:id="rId17">
+      <w:hyperlink r:id="rId16">
         <w:r>
           <w:rPr>
             <w:rStyle w:val="Hyperlink"/>
@@ -921,7 +943,7 @@
       <w:r>
         <w:t xml:space="preserve"> </w:t>
       </w:r>
-      <w:hyperlink r:id="rId18">
+      <w:hyperlink r:id="rId17">
         <w:r>
           <w:rPr>
             <w:rStyle w:val="Hyperlink"/>
@@ -1162,8 +1184,8 @@
         <w:t xml:space="preserve">optimization algorithms, gradient descent, convergence analysis, numerical methods, mathematical programming, reproducible research, infrastructure automation</w:t>
       </w:r>
     </w:p>
-    <w:bookmarkEnd w:id="19"/>
-    <w:bookmarkStart w:id="28" w:name="sec:introduction"/>
+    <w:bookmarkEnd w:id="18"/>
+    <w:bookmarkStart w:id="27" w:name="sec:introduction"/>
     <w:p>
       <w:pPr>
         <w:pStyle w:val="Heading1"/>
@@ -1197,7 +1219,7 @@
       <w:r>
         <w:t xml:space="preserve"> </w:t>
       </w:r>
-      <w:hyperlink r:id="rId17">
+      <w:hyperlink r:id="rId16">
         <w:r>
           <w:rPr>
             <w:rStyle w:val="Hyperlink"/>
@@ -1227,7 +1249,7 @@
         <w:t xml:space="preserve">compilation.</w:t>
       </w:r>
     </w:p>
-    <w:bookmarkStart w:id="22" w:name="template-architecture-context"/>
+    <w:bookmarkStart w:id="21" w:name="template-architecture-context"/>
     <w:p>
       <w:pPr>
         <w:pStyle w:val="Heading2"/>
@@ -1329,7 +1351,7 @@
       <w:r>
         <w:t xml:space="preserve"> </w:t>
       </w:r>
-      <w:hyperlink r:id="rId20">
+      <w:hyperlink r:id="rId19">
         <w:r>
           <w:rPr>
             <w:rStyle w:val="Hyperlink"/>
@@ -1431,7 +1453,7 @@
       <w:r>
         <w:t xml:space="preserve"> </w:t>
       </w:r>
-      <w:hyperlink r:id="rId21">
+      <w:hyperlink r:id="rId20">
         <w:r>
           <w:rPr>
             <w:rStyle w:val="Hyperlink"/>
@@ -1505,8 +1527,8 @@
         <w:t xml:space="preserve">is a continuously differentiable objective function.</w:t>
       </w:r>
     </w:p>
-    <w:bookmarkEnd w:id="22"/>
-    <w:bookmarkStart w:id="23" w:name="infrastructure-integration"/>
+    <w:bookmarkEnd w:id="21"/>
+    <w:bookmarkStart w:id="22" w:name="infrastructure-integration"/>
     <w:p>
       <w:pPr>
         <w:pStyle w:val="Heading2"/>
@@ -1691,8 +1713,8 @@
         <w:t xml:space="preserve">to automatically transform code outputs into this finalized manuscript.</w:t>
       </w:r>
     </w:p>
-    <w:bookmarkEnd w:id="23"/>
-    <w:bookmarkStart w:id="24" w:name="algorithm-overview"/>
+    <w:bookmarkEnd w:id="22"/>
+    <w:bookmarkStart w:id="23" w:name="algorithm-overview"/>
     <w:p>
       <w:pPr>
         <w:pStyle w:val="Heading2"/>
@@ -1810,8 +1832,8 @@
         <w:t xml:space="preserve">.</w:t>
       </w:r>
     </w:p>
-    <w:bookmarkEnd w:id="24"/>
-    <w:bookmarkStart w:id="25" w:name="exemplar-implementation-goals"/>
+    <w:bookmarkEnd w:id="23"/>
+    <w:bookmarkStart w:id="24" w:name="exemplar-implementation-goals"/>
     <w:p>
       <w:pPr>
         <w:pStyle w:val="Heading2"/>
@@ -1934,8 +1956,8 @@
         <w:t xml:space="preserve">guidelines, ensuring the logic remains verifiable by both human and artificial intelligence.</w:t>
       </w:r>
     </w:p>
-    <w:bookmarkEnd w:id="25"/>
-    <w:bookmarkStart w:id="26" w:name="readers-guide-to-the-manuscript"/>
+    <w:bookmarkEnd w:id="24"/>
+    <w:bookmarkStart w:id="25" w:name="readers-guide-to-the-manuscript"/>
     <w:p>
       <w:pPr>
         <w:pStyle w:val="Heading2"/>
@@ -2150,8 +2172,8 @@
         <w:t xml:space="preserve">states scope and related literature so the exemplar is not mistaken for a general-purpose optimizer benchmark suite.</w:t>
       </w:r>
     </w:p>
-    <w:bookmarkEnd w:id="26"/>
-    <w:bookmarkStart w:id="27" w:name="why-a-quadratic-model"/>
+    <w:bookmarkEnd w:id="25"/>
+    <w:bookmarkStart w:id="26" w:name="why-a-quadratic-model"/>
     <w:p>
       <w:pPr>
         <w:pStyle w:val="Heading2"/>
@@ -2348,9 +2370,9 @@
         <w:t xml:space="preserve">in 1D) visible in both plots and CSV rows without requiring trust-region or line-search fixes—those extensions are left to future work (sec. 8).</w:t>
       </w:r>
     </w:p>
+    <w:bookmarkEnd w:id="26"/>
     <w:bookmarkEnd w:id="27"/>
-    <w:bookmarkEnd w:id="28"/>
-    <w:bookmarkStart w:id="49" w:name="sec:methodology"/>
+    <w:bookmarkStart w:id="48" w:name="sec:methodology"/>
     <w:p>
       <w:pPr>
         <w:pStyle w:val="Heading1"/>
@@ -2397,7 +2419,7 @@
         <w:t xml:space="preserve">ecosystems.</w:t>
       </w:r>
     </w:p>
-    <w:bookmarkStart w:id="33" w:name="algorithm-implementation"/>
+    <w:bookmarkStart w:id="32" w:name="algorithm-implementation"/>
     <w:p>
       <w:pPr>
         <w:pStyle w:val="Heading2"/>
@@ -2406,7 +2428,7 @@
         <w:t xml:space="preserve">Algorithm Implementation</w:t>
       </w:r>
     </w:p>
-    <w:bookmarkStart w:id="32" w:name="gradient-descent-algorithm"/>
+    <w:bookmarkStart w:id="31" w:name="gradient-descent-algorithm"/>
     <w:p>
       <w:pPr>
         <w:pStyle w:val="Heading3"/>
@@ -2425,7 +2447,7 @@
       <w:r>
         <w:t xml:space="preserve"> </w:t>
       </w:r>
-      <w:hyperlink r:id="rId21">
+      <w:hyperlink r:id="rId20">
         <w:r>
           <w:rPr>
             <w:rStyle w:val="VerbatimChar"/>
@@ -2469,7 +2491,7 @@
       <w:r>
         <w:t xml:space="preserve"> </w:t>
       </w:r>
-      <w:hyperlink r:id="rId29">
+      <w:hyperlink r:id="rId28">
         <w:r>
           <w:rPr>
             <w:rStyle w:val="Hyperlink"/>
@@ -2498,7 +2520,7 @@
       <w:r>
         <w:t xml:space="preserve"> </w:t>
       </w:r>
-      <w:hyperlink r:id="rId30">
+      <w:hyperlink r:id="rId29">
         <w:r>
           <w:rPr>
             <w:rStyle w:val="Hyperlink"/>
@@ -2528,7 +2550,7 @@
         </w:rPr>
         <w:t xml:space="preserve"> </w:t>
       </w:r>
-      <w:hyperlink r:id="rId31">
+      <w:hyperlink r:id="rId30">
         <w:r>
           <w:rPr>
             <w:rStyle w:val="Hyperlink"/>
@@ -3039,9 +3061,9 @@
         <w:t xml:space="preserve">(max iterations reached)</w:t>
       </w:r>
     </w:p>
+    <w:bookmarkEnd w:id="31"/>
     <w:bookmarkEnd w:id="32"/>
-    <w:bookmarkEnd w:id="33"/>
-    <w:bookmarkStart w:id="38" w:name="infrastructure-integration-1"/>
+    <w:bookmarkStart w:id="37" w:name="infrastructure-integration-1"/>
     <w:p>
       <w:pPr>
         <w:pStyle w:val="Heading2"/>
@@ -3073,7 +3095,7 @@
         <w:t xml:space="preserve">module.</w:t>
       </w:r>
     </w:p>
-    <w:bookmarkStart w:id="35" w:name="numerical-stability-analysis"/>
+    <w:bookmarkStart w:id="34" w:name="numerical-stability-analysis"/>
     <w:p>
       <w:pPr>
         <w:pStyle w:val="Heading3"/>
@@ -3130,7 +3152,7 @@
       <w:r>
         <w:t xml:space="preserve"> </w:t>
       </w:r>
-      <w:hyperlink r:id="rId34">
+      <w:hyperlink r:id="rId33">
         <w:r>
           <w:rPr>
             <w:rStyle w:val="Hyperlink"/>
@@ -3145,8 +3167,8 @@
         <w:t xml:space="preserve">execution deliberately aborts, ensuring the methodology cannot enter unrecoverable states.</w:t>
       </w:r>
     </w:p>
-    <w:bookmarkEnd w:id="35"/>
-    <w:bookmarkStart w:id="37" w:name="performance-benchmarking"/>
+    <w:bookmarkEnd w:id="34"/>
+    <w:bookmarkStart w:id="36" w:name="performance-benchmarking"/>
     <w:p>
       <w:pPr>
         <w:pStyle w:val="Heading3"/>
@@ -3165,7 +3187,7 @@
       <w:r>
         <w:t xml:space="preserve"> </w:t>
       </w:r>
-      <w:hyperlink r:id="rId36">
+      <w:hyperlink r:id="rId35">
         <w:r>
           <w:rPr>
             <w:rStyle w:val="VerbatimChar"/>
@@ -3206,9 +3228,9 @@
         <w:t xml:space="preserve">space-time complexity predictions hold true on the host architecture.</w:t>
       </w:r>
     </w:p>
+    <w:bookmarkEnd w:id="36"/>
     <w:bookmarkEnd w:id="37"/>
-    <w:bookmarkEnd w:id="38"/>
-    <w:bookmarkStart w:id="39" w:name="convergence-analysis"/>
+    <w:bookmarkStart w:id="38" w:name="convergence-analysis"/>
     <w:p>
       <w:pPr>
         <w:pStyle w:val="Heading2"/>
@@ -3465,8 +3487,8 @@
         <w:t xml:space="preserve">.</w:t>
       </w:r>
     </w:p>
-    <w:bookmarkEnd w:id="39"/>
-    <w:bookmarkStart w:id="46" w:name="experimental-setup"/>
+    <w:bookmarkEnd w:id="38"/>
+    <w:bookmarkStart w:id="45" w:name="experimental-setup"/>
     <w:p>
       <w:pPr>
         <w:pStyle w:val="Heading2"/>
@@ -3475,7 +3497,7 @@
         <w:t xml:space="preserve">Experimental Setup</w:t>
       </w:r>
     </w:p>
-    <w:bookmarkStart w:id="40" w:name="step-size-analysis"/>
+    <w:bookmarkStart w:id="39" w:name="step-size-analysis"/>
     <w:p>
       <w:pPr>
         <w:pStyle w:val="Heading3"/>
@@ -4013,8 +4035,8 @@
         <w:t xml:space="preserve">).</w:t>
       </w:r>
     </w:p>
-    <w:bookmarkEnd w:id="40"/>
-    <w:bookmarkStart w:id="43" w:name="zero-mock-testing-methodology"/>
+    <w:bookmarkEnd w:id="39"/>
+    <w:bookmarkStart w:id="42" w:name="zero-mock-testing-methodology"/>
     <w:p>
       <w:pPr>
         <w:pStyle w:val="Heading3"/>
@@ -4067,7 +4089,7 @@
       <w:r>
         <w:t xml:space="preserve"> </w:t>
       </w:r>
-      <w:hyperlink r:id="rId41">
+      <w:hyperlink r:id="rId40">
         <w:r>
           <w:rPr>
             <w:rStyle w:val="VerbatimChar"/>
@@ -4114,7 +4136,7 @@
       <w:r>
         <w:t xml:space="preserve"> </w:t>
       </w:r>
-      <w:hyperlink r:id="rId42">
+      <w:hyperlink r:id="rId41">
         <w:r>
           <w:rPr>
             <w:rStyle w:val="VerbatimChar"/>
@@ -4181,7 +4203,7 @@
       <w:r>
         <w:t xml:space="preserve"> </w:t>
       </w:r>
-      <w:hyperlink r:id="rId20">
+      <w:hyperlink r:id="rId19">
         <w:r>
           <w:rPr>
             <w:rStyle w:val="Hyperlink"/>
@@ -4211,8 +4233,8 @@
         <w:t xml:space="preserve">prior to treating the project as build-green.</w:t>
       </w:r>
     </w:p>
-    <w:bookmarkEnd w:id="43"/>
-    <w:bookmarkStart w:id="44" w:name="stopping-rule-and-reporting"/>
+    <w:bookmarkEnd w:id="42"/>
+    <w:bookmarkStart w:id="43" w:name="stopping-rule-and-reporting"/>
     <w:p>
       <w:pPr>
         <w:pStyle w:val="Heading3"/>
@@ -4380,14 +4402,159 @@
         <w:t xml:space="preserve">placeholders so tables and prose cannot drift from the last analysis run.</w:t>
       </w:r>
     </w:p>
+    <w:bookmarkEnd w:id="43"/>
+    <w:bookmarkStart w:id="44" w:name="figure-generation-contract"/>
+    <w:p>
+      <w:pPr>
+        <w:pStyle w:val="Heading3"/>
+      </w:pPr>
+      <w:r>
+        <w:t xml:space="preserve">Figure generation contract</w:t>
+      </w:r>
+    </w:p>
+    <w:p>
+      <w:pPr>
+        <w:pStyle w:val="FirstParagraph"/>
+      </w:pPr>
+      <w:r>
+        <w:t xml:space="preserve">Each figure in</w:t>
+      </w:r>
+      <w:r>
+        <w:t xml:space="preserve"> </w:t>
+      </w:r>
+      <w:r>
+        <w:rPr>
+          <w:rStyle w:val="VerbatimChar"/>
+        </w:rPr>
+        <w:t xml:space="preserve">03_results.md</w:t>
+      </w:r>
+      <w:r>
+        <w:t xml:space="preserve"> </w:t>
+      </w:r>
+      <w:r>
+        <w:t xml:space="preserve">maps to a generator in</w:t>
+      </w:r>
+      <w:r>
+        <w:t xml:space="preserve"> </w:t>
+      </w:r>
+      <w:r>
+        <w:rPr>
+          <w:rStyle w:val="VerbatimChar"/>
+        </w:rPr>
+        <w:t xml:space="preserve">src/figures/</w:t>
+      </w:r>
+      <w:r>
+        <w:t xml:space="preserve"> </w:t>
+      </w:r>
+      <w:r>
+        <w:t xml:space="preserve">(</w:t>
+      </w:r>
+      <w:r>
+        <w:rPr>
+          <w:rStyle w:val="VerbatimChar"/>
+        </w:rPr>
+        <w:t xml:space="preserve">generate_convergence_plot</w:t>
+      </w:r>
+      <w:r>
+        <w:t xml:space="preserve">,</w:t>
+      </w:r>
+      <w:r>
+        <w:t xml:space="preserve"> </w:t>
+      </w:r>
+      <w:r>
+        <w:rPr>
+          <w:rStyle w:val="VerbatimChar"/>
+        </w:rPr>
+        <w:t xml:space="preserve">generate_step_size_sensitivity_plot</w:t>
+      </w:r>
+      <w:r>
+        <w:t xml:space="preserve">,</w:t>
+      </w:r>
+      <w:r>
+        <w:t xml:space="preserve"> </w:t>
+      </w:r>
+      <w:r>
+        <w:rPr>
+          <w:rStyle w:val="VerbatimChar"/>
+        </w:rPr>
+        <w:t xml:space="preserve">generate_convergence_rate_plot</w:t>
+      </w:r>
+      <w:r>
+        <w:t xml:space="preserve">,</w:t>
+      </w:r>
+      <w:r>
+        <w:t xml:space="preserve"> </w:t>
+      </w:r>
+      <w:r>
+        <w:rPr>
+          <w:rStyle w:val="VerbatimChar"/>
+        </w:rPr>
+        <w:t xml:space="preserve">generate_complexity_visualization</w:t>
+      </w:r>
+      <w:r>
+        <w:t xml:space="preserve">,</w:t>
+      </w:r>
+      <w:r>
+        <w:t xml:space="preserve"> </w:t>
+      </w:r>
+      <w:r>
+        <w:rPr>
+          <w:rStyle w:val="VerbatimChar"/>
+        </w:rPr>
+        <w:t xml:space="preserve">generate_stability_visualization</w:t>
+      </w:r>
+      <w:r>
+        <w:t xml:space="preserve">,</w:t>
+      </w:r>
+      <w:r>
+        <w:t xml:space="preserve"> </w:t>
+      </w:r>
+      <w:r>
+        <w:rPr>
+          <w:rStyle w:val="VerbatimChar"/>
+        </w:rPr>
+        <w:t xml:space="preserve">generate_benchmark_visualization</w:t>
+      </w:r>
+      <w:r>
+        <w:t xml:space="preserve">), orchestrated by</w:t>
+      </w:r>
+      <w:r>
+        <w:t xml:space="preserve"> </w:t>
+      </w:r>
+      <w:r>
+        <w:rPr>
+          <w:rStyle w:val="VerbatimChar"/>
+        </w:rPr>
+        <w:t xml:space="preserve">src/analysis/</w:t>
+      </w:r>
+      <w:r>
+        <w:t xml:space="preserve"> </w:t>
+      </w:r>
+      <w:r>
+        <w:t xml:space="preserve">/</w:t>
+      </w:r>
+      <w:r>
+        <w:t xml:space="preserve"> </w:t>
+      </w:r>
+      <w:r>
+        <w:rPr>
+          <w:rStyle w:val="VerbatimChar"/>
+        </w:rPr>
+        <w:t xml:space="preserve">scripts/optimization_analysis.py</w:t>
+      </w:r>
+      <w:r>
+        <w:t xml:space="preserve">. Captions in the markdown intentionally name the function and the key parameters (tolerance lines, grids, dimensions) so reviewers can navigate from PDF to code without inferring hidden defaults.</w:t>
+      </w:r>
+    </w:p>
     <w:bookmarkEnd w:id="44"/>
-    <w:bookmarkStart w:id="45" w:name="figure-generation-contract"/>
-    <w:p>
-      <w:pPr>
-        <w:pStyle w:val="Heading3"/>
-      </w:pPr>
-      <w:r>
-        <w:t xml:space="preserve">Figure generation contract</w:t>
+    <w:bookmarkEnd w:id="45"/>
+    <w:bookmarkStart w:id="47" w:name="analysis-pipeline-latex-integration"/>
+    <w:p>
+      <w:pPr>
+        <w:pStyle w:val="Heading2"/>
+      </w:pPr>
+      <w:r>
+        <w:t xml:space="preserve">Analysis Pipeline &amp; LaTeX Integration</w:t>
       </w:r>
     </w:p>
     <w:p>
@@ -4395,157 +4562,12 @@
         <w:pStyle w:val="FirstParagraph"/>
       </w:pPr>
       <w:r>
-        <w:t xml:space="preserve">Each figure in</w:t>
-      </w:r>
-      <w:r>
-        <w:t xml:space="preserve"> </w:t>
-      </w:r>
-      <w:r>
-        <w:rPr>
-          <w:rStyle w:val="VerbatimChar"/>
-        </w:rPr>
-        <w:t xml:space="preserve">03_results.md</w:t>
-      </w:r>
-      <w:r>
-        <w:t xml:space="preserve"> </w:t>
-      </w:r>
-      <w:r>
-        <w:t xml:space="preserve">maps to a generator in</w:t>
-      </w:r>
-      <w:r>
-        <w:t xml:space="preserve"> </w:t>
-      </w:r>
-      <w:r>
-        <w:rPr>
-          <w:rStyle w:val="VerbatimChar"/>
-        </w:rPr>
-        <w:t xml:space="preserve">src/figures/</w:t>
-      </w:r>
-      <w:r>
-        <w:t xml:space="preserve"> </w:t>
-      </w:r>
-      <w:r>
-        <w:t xml:space="preserve">(</w:t>
-      </w:r>
-      <w:r>
-        <w:rPr>
-          <w:rStyle w:val="VerbatimChar"/>
-        </w:rPr>
-        <w:t xml:space="preserve">generate_convergence_plot</w:t>
-      </w:r>
-      <w:r>
-        <w:t xml:space="preserve">,</w:t>
-      </w:r>
-      <w:r>
-        <w:t xml:space="preserve"> </w:t>
-      </w:r>
-      <w:r>
-        <w:rPr>
-          <w:rStyle w:val="VerbatimChar"/>
-        </w:rPr>
-        <w:t xml:space="preserve">generate_step_size_sensitivity_plot</w:t>
-      </w:r>
-      <w:r>
-        <w:t xml:space="preserve">,</w:t>
-      </w:r>
-      <w:r>
-        <w:t xml:space="preserve"> </w:t>
-      </w:r>
-      <w:r>
-        <w:rPr>
-          <w:rStyle w:val="VerbatimChar"/>
-        </w:rPr>
-        <w:t xml:space="preserve">generate_convergence_rate_plot</w:t>
-      </w:r>
-      <w:r>
-        <w:t xml:space="preserve">,</w:t>
-      </w:r>
-      <w:r>
-        <w:t xml:space="preserve"> </w:t>
-      </w:r>
-      <w:r>
-        <w:rPr>
-          <w:rStyle w:val="VerbatimChar"/>
-        </w:rPr>
-        <w:t xml:space="preserve">generate_complexity_visualization</w:t>
-      </w:r>
-      <w:r>
-        <w:t xml:space="preserve">,</w:t>
-      </w:r>
-      <w:r>
-        <w:t xml:space="preserve"> </w:t>
-      </w:r>
-      <w:r>
-        <w:rPr>
-          <w:rStyle w:val="VerbatimChar"/>
-        </w:rPr>
-        <w:t xml:space="preserve">generate_stability_visualization</w:t>
-      </w:r>
-      <w:r>
-        <w:t xml:space="preserve">,</w:t>
-      </w:r>
-      <w:r>
-        <w:t xml:space="preserve"> </w:t>
-      </w:r>
-      <w:r>
-        <w:rPr>
-          <w:rStyle w:val="VerbatimChar"/>
-        </w:rPr>
-        <w:t xml:space="preserve">generate_benchmark_visualization</w:t>
-      </w:r>
-      <w:r>
-        <w:t xml:space="preserve">), orchestrated by</w:t>
-      </w:r>
-      <w:r>
-        <w:t xml:space="preserve"> </w:t>
-      </w:r>
-      <w:r>
-        <w:rPr>
-          <w:rStyle w:val="VerbatimChar"/>
-        </w:rPr>
-        <w:t xml:space="preserve">src/analysis/</w:t>
-      </w:r>
-      <w:r>
-        <w:t xml:space="preserve"> </w:t>
-      </w:r>
-      <w:r>
-        <w:t xml:space="preserve">/</w:t>
-      </w:r>
-      <w:r>
-        <w:t xml:space="preserve"> </w:t>
-      </w:r>
-      <w:r>
-        <w:rPr>
-          <w:rStyle w:val="VerbatimChar"/>
-        </w:rPr>
-        <w:t xml:space="preserve">scripts/optimization_analysis.py</w:t>
-      </w:r>
-      <w:r>
-        <w:t xml:space="preserve">. Captions in the markdown intentionally name the function and the key parameters (tolerance lines, grids, dimensions) so reviewers can navigate from PDF to code without inferring hidden defaults.</w:t>
-      </w:r>
-    </w:p>
-    <w:bookmarkEnd w:id="45"/>
-    <w:bookmarkEnd w:id="46"/>
-    <w:bookmarkStart w:id="48" w:name="analysis-pipeline-latex-integration"/>
-    <w:p>
-      <w:pPr>
-        <w:pStyle w:val="Heading2"/>
-      </w:pPr>
-      <w:r>
-        <w:t xml:space="preserve">Analysis Pipeline &amp; LaTeX Integration</w:t>
-      </w:r>
-    </w:p>
-    <w:p>
-      <w:pPr>
-        <w:pStyle w:val="FirstParagraph"/>
-      </w:pPr>
-      <w:r>
         <w:t xml:space="preserve">The automated analysis script leverages</w:t>
       </w:r>
       <w:r>
         <w:t xml:space="preserve"> </w:t>
       </w:r>
-      <w:hyperlink r:id="rId47">
+      <w:hyperlink r:id="rId46">
         <w:r>
           <w:rPr>
             <w:rStyle w:val="VerbatimChar"/>
@@ -4631,9 +4653,9 @@
         <w:t xml:space="preserve">, automatically linking compiled PGF plots and BibTeX citations. This automated approach ensures an unbreakable chain of custody from raw algorithmic execution to the final rendered manuscript.</w:t>
       </w:r>
     </w:p>
+    <w:bookmarkEnd w:id="47"/>
     <w:bookmarkEnd w:id="48"/>
-    <w:bookmarkEnd w:id="49"/>
-    <w:bookmarkStart w:id="97" w:name="sec:results"/>
+    <w:bookmarkStart w:id="96" w:name="sec:results"/>
     <w:p>
       <w:pPr>
         <w:pStyle w:val="Heading1"/>
@@ -4667,7 +4689,7 @@
       <w:r>
         <w:t xml:space="preserve"> </w:t>
       </w:r>
-      <w:hyperlink r:id="rId29">
+      <w:hyperlink r:id="rId28">
         <w:r>
           <w:rPr>
             <w:rStyle w:val="Hyperlink"/>
@@ -4679,7 +4701,7 @@
         <w:t xml:space="preserve">. No manual transcription was permitted.</w:t>
       </w:r>
     </w:p>
-    <w:bookmarkStart w:id="60" w:name="convergence-analysis-1"/>
+    <w:bookmarkStart w:id="59" w:name="convergence-analysis-1"/>
     <w:p>
       <w:pPr>
         <w:pStyle w:val="Heading2"/>
@@ -4688,7 +4710,7 @@
         <w:t xml:space="preserve">Convergence Analysis</w:t>
       </w:r>
     </w:p>
-    <w:bookmarkStart w:id="54" w:name="convergence-trajectories"/>
+    <w:bookmarkStart w:id="53" w:name="convergence-trajectories"/>
     <w:p>
       <w:pPr>
         <w:pStyle w:val="Heading3"/>
@@ -4823,7 +4845,7 @@
         <w:t xml:space="preserve">.</w:t>
       </w:r>
     </w:p>
-    <w:bookmarkStart w:id="53" w:name="fig:convergence"/>
+    <w:bookmarkStart w:id="52" w:name="fig:convergence"/>
     <w:p>
       <w:pPr>
         <w:pStyle w:val="CaptionedFigure"/>
@@ -4833,18 +4855,18 @@
           <wp:inline>
             <wp:extent cx="5334000" cy="3707780"/>
             <wp:effectExtent b="0" l="0" r="0" t="0"/>
-            <wp:docPr descr="Figure 1: Objective value f(x_k)=\tfrac{1}{2}x_k^2 - x_k versus iteration k for gradient descent at six step sizes (legend colours follow the agency taxonomy in sec. 3: blue = conservative, green = near-optimal, orange = aggressive, red = divergent). Trajectories are produced by simulate_trajectory() in src/optimizer.py, which calls the same gradient_descent() used in tbl. 1; the upper bound on the y-axis clips the divergent \alpha=2.5 curve so that stable trajectories remain visible. Dashed grey reference line marks the analytic optimum f(x^\ast)=-0.5. Fastest configuration in this experiment: \alpha=1.0 converges in 1 iteration(s)." title="" id="51" name="Picture"/>
+            <wp:docPr descr="Figure 1: Objective value f(x_k)=\tfrac{1}{2}x_k^2 - x_k versus iteration k for gradient descent at six step sizes (legend colours follow the agency taxonomy in sec. 3: blue = conservative, green = near-optimal, orange = aggressive, red = divergent). Trajectories are produced by simulate_trajectory() in src/optimizer.py, which calls the same gradient_descent() used in tbl. 1; the upper bound on the y-axis clips the divergent \alpha=2.5 curve so that stable trajectories remain visible. Dashed grey reference line marks the analytic optimum f(x^\ast)=-0.5. Fastest configuration in this experiment: \alpha=1.0 converges in 1 iteration(s)." title="" id="50" name="Picture"/>
             <a:graphic>
               <a:graphicData uri="http://schemas.openxmlformats.org/drawingml/2006/picture">
                 <pic:pic>
                   <pic:nvPicPr>
-                    <pic:cNvPr descr="../figures/convergence_plot.png" id="52" name="Picture"/>
+                    <pic:cNvPr descr="../figures/convergence_plot.png" id="51" name="Picture"/>
                     <pic:cNvPicPr>
                       <a:picLocks noChangeArrowheads="1" noChangeAspect="1"/>
                     </pic:cNvPicPr>
                   </pic:nvPicPr>
                   <pic:blipFill>
-                    <a:blip r:embed="rId50"/>
+                    <a:blip r:embed="rId49"/>
                     <a:stretch>
                       <a:fillRect/>
                     </a:stretch>
@@ -5128,7 +5150,7 @@
         <w:t xml:space="preserve">converges in 1 iteration(s).</w:t>
       </w:r>
     </w:p>
-    <w:bookmarkEnd w:id="53"/>
+    <w:bookmarkEnd w:id="52"/>
     <w:p>
       <w:pPr>
         <w:pStyle w:val="BodyText"/>
@@ -5376,8 +5398,8 @@
         <w:t xml:space="preserve">diverges</w:t>
       </w:r>
     </w:p>
-    <w:bookmarkEnd w:id="54"/>
-    <w:bookmarkStart w:id="59" w:name="step-size-sensitivity-analysis"/>
+    <w:bookmarkEnd w:id="53"/>
+    <w:bookmarkStart w:id="58" w:name="step-size-sensitivity-analysis"/>
     <w:p>
       <w:pPr>
         <w:pStyle w:val="Heading3"/>
@@ -5394,7 +5416,7 @@
         <w:t xml:space="preserve">fig. 2 examines how the choice of step size affects the convergence path and solution quality. The analysis reveals the trade-off between convergence speed and numerical stability.</w:t>
       </w:r>
     </w:p>
-    <w:bookmarkStart w:id="58" w:name="fig:step_sensitivity"/>
+    <w:bookmarkStart w:id="57" w:name="fig:step_sensitivity"/>
     <w:p>
       <w:pPr>
         <w:pStyle w:val="CaptionedFigure"/>
@@ -5404,18 +5426,18 @@
           <wp:inline>
             <wp:extent cx="5334000" cy="2250763"/>
             <wp:effectExtent b="0" l="0" r="0" t="0"/>
-            <wp:docPr descr="Figure 2: Sensitivity sweep produced by generate_step_size_sensitivity_plot() over an independent dense grid \alpha \in [0.005, 0.4] (10 points), distinct from the discrete experiment.step_sizes used elsewhere in this section. Left: iterations to convergence on log–log axes — the curve drops sharply from 500 iterations at the smallest \alpha (the max_iterations cap in this sub-experiment) to 37 iterations at \alpha=0.4, illustrating the geometric speedup as \rho(\alpha)=|1-\alpha| shrinks. Right: final f(x) versus \alpha with horizontal reference lines at f(x_0)=0 (initial) and f(x^\ast)=-0.5 (analytic optimum); every \alpha in this stable window lands on the optimum." title="" id="56" name="Picture"/>
+            <wp:docPr descr="Figure 2: Sensitivity sweep produced by generate_step_size_sensitivity_plot() over an independent dense grid \alpha \in [0.005, 0.4] (10 points), distinct from the discrete experiment.step_sizes used elsewhere in this section. Left: iterations to convergence on log–log axes — the curve drops sharply from 500 iterations at the smallest \alpha (the max_iterations cap in this sub-experiment) to 37 iterations at \alpha=0.4, illustrating the geometric speedup as \rho(\alpha)=|1-\alpha| shrinks. Right: final f(x) versus \alpha with horizontal reference lines at f(x_0)=0 (initial) and f(x^\ast)=-0.5 (analytic optimum); every \alpha in this stable window lands on the optimum." title="" id="55" name="Picture"/>
             <a:graphic>
               <a:graphicData uri="http://schemas.openxmlformats.org/drawingml/2006/picture">
                 <pic:pic>
                   <pic:nvPicPr>
-                    <pic:cNvPr descr="../figures/step_size_sensitivity.png" id="57" name="Picture"/>
+                    <pic:cNvPr descr="../figures/step_size_sensitivity.png" id="56" name="Picture"/>
                     <pic:cNvPicPr>
                       <a:picLocks noChangeArrowheads="1" noChangeAspect="1"/>
                     </pic:cNvPicPr>
                   </pic:nvPicPr>
                   <pic:blipFill>
-                    <a:blip r:embed="rId55"/>
+                    <a:blip r:embed="rId54"/>
                     <a:stretch>
                       <a:fillRect/>
                     </a:stretch>
@@ -5792,10 +5814,10 @@
         <w:t xml:space="preserve">in this stable window lands on the optimum.</w:t>
       </w:r>
     </w:p>
+    <w:bookmarkEnd w:id="57"/>
     <w:bookmarkEnd w:id="58"/>
     <w:bookmarkEnd w:id="59"/>
-    <w:bookmarkEnd w:id="60"/>
-    <w:bookmarkStart w:id="63" w:name="quantitative-results"/>
+    <w:bookmarkStart w:id="62" w:name="quantitative-results"/>
     <w:p>
       <w:pPr>
         <w:pStyle w:val="Heading2"/>
@@ -5814,7 +5836,7 @@
       <w:r>
         <w:t xml:space="preserve"> </w:t>
       </w:r>
-      <w:hyperlink r:id="rId61">
+      <w:hyperlink r:id="rId60">
         <w:r>
           <w:rPr>
             <w:rStyle w:val="VerbatimChar"/>
@@ -5904,7 +5926,7 @@
         <w:t xml:space="preserve">).</w:t>
       </w:r>
     </w:p>
-    <w:bookmarkStart w:id="62" w:name="tbl:opt_results"/>
+    <w:bookmarkStart w:id="61" w:name="tbl:opt_results"/>
     <w:p>
       <w:pPr>
         <w:pStyle w:val="TableCaption"/>
@@ -6510,9 +6532,9 @@
         </w:tc>
       </w:tr>
     </w:tbl>
+    <w:bookmarkEnd w:id="61"/>
     <w:bookmarkEnd w:id="62"/>
-    <w:bookmarkEnd w:id="63"/>
-    <w:bookmarkStart w:id="71" w:name="convergence-rate-analysis"/>
+    <w:bookmarkStart w:id="70" w:name="convergence-rate-analysis"/>
     <w:p>
       <w:pPr>
         <w:pStyle w:val="Heading2"/>
@@ -6521,7 +6543,7 @@
         <w:t xml:space="preserve">Convergence Rate Analysis</w:t>
       </w:r>
     </w:p>
-    <w:bookmarkStart w:id="68" w:name="theoretical-vs-empirical-convergence"/>
+    <w:bookmarkStart w:id="67" w:name="theoretical-vs-empirical-convergence"/>
     <w:p>
       <w:pPr>
         <w:pStyle w:val="Heading3"/>
@@ -6555,7 +6577,7 @@
         <w:t xml:space="preserve">fig. 3 provides a comparative analysis of convergence rates across different step sizes, validating theoretical predictions against empirical results.</w:t>
       </w:r>
     </w:p>
-    <w:bookmarkStart w:id="67" w:name="fig:convergence_rate"/>
+    <w:bookmarkStart w:id="66" w:name="fig:convergence_rate"/>
     <w:p>
       <w:pPr>
         <w:pStyle w:val="CaptionedFigure"/>
@@ -6565,18 +6587,18 @@
           <wp:inline>
             <wp:extent cx="5334000" cy="3754843"/>
             <wp:effectExtent b="0" l="0" r="0" t="0"/>
-            <wp:docPr descr="Figure 3: Absolute objective error |f(x_k)-f(x^\ast)| versus iteration on a logarithmic y-axis, generated by generate_convergence_rate_plot(). Stable step sizes produce straight lines whose slopes equal 2\log_{10}\rho(\alpha) (per eq. ¿eq:convergence_bound?); \alpha=1.0 (\rho=0) collapses to the optimum in one step (vertical green line at k=1); \alpha=1.5 (orange) descends fastest among the multi-step contractions because \rho=0.5; the divergent \alpha=2.5 curve (red) climbs upward at slope 2\log_{10}(1.5). Horizontal dashed line marks the gradient-norm tolerance \varepsilon = 10^{-8} read from experiment.convergence_tolerance." title="" id="65" name="Picture"/>
+            <wp:docPr descr="Figure 3: Absolute objective error |f(x_k)-f(x^\ast)| versus iteration on a logarithmic y-axis, generated by generate_convergence_rate_plot(). Stable step sizes produce straight lines whose slopes equal 2\log_{10}\rho(\alpha) (per eq. ¿eq:convergence_bound?); \alpha=1.0 (\rho=0) collapses to the optimum in one step (vertical green line at k=1); \alpha=1.5 (orange) descends fastest among the multi-step contractions because \rho=0.5; the divergent \alpha=2.5 curve (red) climbs upward at slope 2\log_{10}(1.5). Horizontal dashed line marks the gradient-norm tolerance \varepsilon = 10^{-8} read from experiment.convergence_tolerance." title="" id="64" name="Picture"/>
             <a:graphic>
               <a:graphicData uri="http://schemas.openxmlformats.org/drawingml/2006/picture">
                 <pic:pic>
                   <pic:nvPicPr>
-                    <pic:cNvPr descr="../figures/convergence_rate_comparison.png" id="66" name="Picture"/>
+                    <pic:cNvPr descr="../figures/convergence_rate_comparison.png" id="65" name="Picture"/>
                     <pic:cNvPicPr>
                       <a:picLocks noChangeArrowheads="1" noChangeAspect="1"/>
                     </pic:cNvPicPr>
                   </pic:nvPicPr>
                   <pic:blipFill>
-                    <a:blip r:embed="rId64"/>
+                    <a:blip r:embed="rId63"/>
                     <a:stretch>
                       <a:fillRect/>
                     </a:stretch>
@@ -6983,7 +7005,7 @@
         <w:t xml:space="preserve">.</w:t>
       </w:r>
     </w:p>
-    <w:bookmarkEnd w:id="67"/>
+    <w:bookmarkEnd w:id="66"/>
     <w:p>
       <w:pPr>
         <w:pStyle w:val="BodyText"/>
@@ -7321,8 +7343,8 @@
         <w:t xml:space="preserve">.</w:t>
       </w:r>
     </w:p>
-    <w:bookmarkEnd w:id="68"/>
-    <w:bookmarkStart w:id="69" w:name="error-bounds"/>
+    <w:bookmarkEnd w:id="67"/>
+    <w:bookmarkStart w:id="68" w:name="error-bounds"/>
     <w:p>
       <w:pPr>
         <w:pStyle w:val="Heading3"/>
@@ -7673,8 +7695,8 @@
         <w:t xml:space="preserve">(divergence). tbl. 1 and figs. 1-3 ground these statements in the numbers produced by this repository run.</w:t>
       </w:r>
     </w:p>
-    <w:bookmarkEnd w:id="69"/>
-    <w:bookmarkStart w:id="70" w:name="performance-metrics"/>
+    <w:bookmarkEnd w:id="68"/>
+    <w:bookmarkStart w:id="69" w:name="performance-metrics"/>
     <w:p>
       <w:pPr>
         <w:pStyle w:val="Heading3"/>
@@ -8302,9 +8324,9 @@
         <w:t xml:space="preserve">divergent</w:t>
       </w:r>
     </w:p>
+    <w:bookmarkEnd w:id="69"/>
     <w:bookmarkEnd w:id="70"/>
-    <w:bookmarkEnd w:id="71"/>
-    <w:bookmarkStart w:id="74" w:name="performance-analysis"/>
+    <w:bookmarkStart w:id="73" w:name="performance-analysis"/>
     <w:p>
       <w:pPr>
         <w:pStyle w:val="Heading2"/>
@@ -8313,7 +8335,7 @@
         <w:t xml:space="preserve">Performance Analysis</w:t>
       </w:r>
     </w:p>
-    <w:bookmarkStart w:id="72" w:name="convergence-speed"/>
+    <w:bookmarkStart w:id="71" w:name="convergence-speed"/>
     <w:p>
       <w:pPr>
         <w:pStyle w:val="Heading3"/>
@@ -8354,8 +8376,8 @@
         <w:t xml:space="preserve">Large step sizes converge faster but may be less stable in more complex problems</w:t>
       </w:r>
     </w:p>
-    <w:bookmarkEnd w:id="72"/>
-    <w:bookmarkStart w:id="73" w:name="solution-accuracy"/>
+    <w:bookmarkEnd w:id="71"/>
+    <w:bookmarkStart w:id="72" w:name="solution-accuracy"/>
     <w:p>
       <w:pPr>
         <w:pStyle w:val="Heading3"/>
@@ -8602,9 +8624,9 @@
         <w:t xml:space="preserve">for convergence on quadratic objectives.</w:t>
       </w:r>
     </w:p>
+    <w:bookmarkEnd w:id="72"/>
     <w:bookmarkEnd w:id="73"/>
-    <w:bookmarkEnd w:id="74"/>
-    <w:bookmarkStart w:id="77" w:name="algorithm-characteristics"/>
+    <w:bookmarkStart w:id="76" w:name="algorithm-characteristics"/>
     <w:p>
       <w:pPr>
         <w:pStyle w:val="Heading2"/>
@@ -8613,7 +8635,7 @@
         <w:t xml:space="preserve">Algorithm Characteristics</w:t>
       </w:r>
     </w:p>
-    <w:bookmarkStart w:id="75" w:name="strengths"/>
+    <w:bookmarkStart w:id="74" w:name="strengths"/>
     <w:p>
       <w:pPr>
         <w:pStyle w:val="Heading3"/>
@@ -8679,8 +8701,8 @@
         <w:t xml:space="preserve">: Converges for convex functions under appropriate conditions</w:t>
       </w:r>
     </w:p>
-    <w:bookmarkEnd w:id="75"/>
-    <w:bookmarkStart w:id="76" w:name="limitations"/>
+    <w:bookmarkEnd w:id="74"/>
+    <w:bookmarkStart w:id="75" w:name="limitations"/>
     <w:p>
       <w:pPr>
         <w:pStyle w:val="Heading3"/>
@@ -8746,9 +8768,9 @@
         <w:t xml:space="preserve">: No adaptation to problem characteristics</w:t>
       </w:r>
     </w:p>
+    <w:bookmarkEnd w:id="75"/>
     <w:bookmarkEnd w:id="76"/>
-    <w:bookmarkEnd w:id="77"/>
-    <w:bookmarkStart w:id="94" w:name="computational-performance"/>
+    <w:bookmarkStart w:id="93" w:name="computational-performance"/>
     <w:p>
       <w:pPr>
         <w:pStyle w:val="Heading2"/>
@@ -8757,7 +8779,7 @@
         <w:t xml:space="preserve">Computational Performance</w:t>
       </w:r>
     </w:p>
-    <w:bookmarkStart w:id="82" w:name="algorithm-complexity-visualization"/>
+    <w:bookmarkStart w:id="81" w:name="algorithm-complexity-visualization"/>
     <w:p>
       <w:pPr>
         <w:pStyle w:val="Heading3"/>
@@ -8774,7 +8796,7 @@
         <w:t xml:space="preserve">fig. 4 provides a visualization of the algorithm’s computational characteristics, including time and space complexity analysis across different problem scales.</w:t>
       </w:r>
     </w:p>
-    <w:bookmarkStart w:id="81" w:name="fig:complexity"/>
+    <w:bookmarkStart w:id="80" w:name="fig:complexity"/>
     <w:p>
       <w:pPr>
         <w:pStyle w:val="CaptionedFigure"/>
@@ -8782,20 +8804,20 @@
       <w:r>
         <w:drawing>
           <wp:inline>
-            <wp:extent cx="5334000" cy="4244213"/>
+            <wp:extent cx="5334000" cy="6237349"/>
             <wp:effectExtent b="0" l="0" r="0" t="0"/>
-            <wp:docPr descr="Figure 4: Four-panel diagnostic from generate_complexity_visualization(). Top left: bars give the empirical iteration count per configured \alpha, coloured by agency category; \alpha=1.0 achieves the global minimum of 1 step(s), while \alpha=0.01 and \alpha=2.5 both saturate at the iteration cap N_{\max}=1000 (slow convergence and divergence respectively). Top right: \log_{10}|f(x)-f(x^\ast)| at termination; the four converged rows reach \approx 10^{-16} (machine precision) while \alpha=0.01 stops near 10^{-9} at the cap. Dashed reference at \log_{10}\varepsilon for \varepsilon= experiment.convergence_tolerance. Bottom left: empirical iterations (solid) versus the smooth proxy 1/(2\alpha(1-\alpha)) (dashed) on log axes — a shape comparison, not a tight count prediction for every \alpha. Bottom right: per-step error contraction factor \rho=|1-\alpha| from the unit-Hessian linear recurrence (eq. ¿eq:scalar_linear_update?); the dashed reference at \rho=1 separates stable bars (left of it) from divergent ones (right)." title="" id="79" name="Picture"/>
+            <wp:docPr descr="Figure 4: Four-panel diagnostic from generate_complexity_visualization(). Top left: bars give the empirical iteration count per configured \alpha, coloured by agency category; \alpha=1.0 achieves the global minimum of 1 step(s), while \alpha=0.01 and \alpha=2.5 both saturate at the iteration cap N_{\max}=1000 (slow convergence and divergence respectively). Top right: \log_{10}|f(x)-f(x^\ast)| at termination; the four converged rows reach \approx 10^{-16} (machine precision) while \alpha=0.01 stops near 10^{-9} at the cap. Dashed reference at \log_{10}\varepsilon for \varepsilon= experiment.convergence_tolerance. Bottom left: empirical iterations (solid) versus the smooth proxy 1/(2\alpha(1-\alpha)) (dashed) on log axes — a shape comparison, not a tight count prediction for every \alpha. Bottom right: per-step error contraction factor \rho=|1-\alpha| from the unit-Hessian linear recurrence (eq. ¿eq:scalar_linear_update?); the dashed reference at \rho=1 separates stable bars (left of it) from divergent ones (right)." title="" id="78" name="Picture"/>
             <a:graphic>
               <a:graphicData uri="http://schemas.openxmlformats.org/drawingml/2006/picture">
                 <pic:pic>
                   <pic:nvPicPr>
-                    <pic:cNvPr descr="../figures/algorithm_complexity.png" id="80" name="Picture"/>
+                    <pic:cNvPr descr="../figures/algorithm_complexity.png" id="79" name="Picture"/>
                     <pic:cNvPicPr>
                       <a:picLocks noChangeArrowheads="1" noChangeAspect="1"/>
                     </pic:cNvPicPr>
                   </pic:nvPicPr>
                   <pic:blipFill>
-                    <a:blip r:embed="rId78"/>
+                    <a:blip r:embed="rId77"/>
                     <a:stretch>
                       <a:fillRect/>
                     </a:stretch>
@@ -8803,7 +8825,7 @@
                   <pic:spPr bwMode="auto">
                     <a:xfrm>
                       <a:off x="0" y="0"/>
-                      <a:ext cx="5334000" cy="4244213"/>
+                      <a:ext cx="5334000" cy="6237349"/>
                     </a:xfrm>
                     <a:prstGeom prst="rect">
                       <a:avLst/>
@@ -9393,7 +9415,7 @@
         <w:t xml:space="preserve">separates stable bars (left of it) from divergent ones (right).</w:t>
       </w:r>
     </w:p>
-    <w:bookmarkEnd w:id="81"/>
+    <w:bookmarkEnd w:id="80"/>
     <w:p>
       <w:pPr>
         <w:pStyle w:val="BodyText"/>
@@ -9559,8 +9581,8 @@
         <w:t xml:space="preserve">: Memory-efficient implementation suitable for high-dimensional problems</w:t>
       </w:r>
     </w:p>
-    <w:bookmarkEnd w:id="82"/>
-    <w:bookmarkStart w:id="87" w:name="performance-benchmarking-1"/>
+    <w:bookmarkEnd w:id="81"/>
+    <w:bookmarkStart w:id="86" w:name="performance-benchmarking-1"/>
     <w:p>
       <w:pPr>
         <w:pStyle w:val="Heading3"/>
@@ -9669,7 +9691,7 @@
         <w:t xml:space="preserve">.</w:t>
       </w:r>
     </w:p>
-    <w:bookmarkStart w:id="86" w:name="fig:benchmark"/>
+    <w:bookmarkStart w:id="85" w:name="fig:benchmark"/>
     <w:p>
       <w:pPr>
         <w:pStyle w:val="CaptionedFigure"/>
@@ -9679,18 +9701,18 @@
           <wp:inline>
             <wp:extent cx="5334000" cy="2251305"/>
             <wp:effectExtent b="0" l="0" r="0" t="0"/>
-            <wp:docPr descr="Figure 5: Dimensional scaling from generate_benchmark_visualization(). Dimensions d \in \{1, 2, 5, 10, 20, 50\} run on identity-Hessian quadratics with \alpha=0.1 and gradient tolerance 10^{-10} (both hardcoded in the script for benchmark stability). Left: mean wall-clock time per gradient_descent() call (μs). The flat regime at d \leq 20 reflects per-iteration overhead (Python dispatch, NumPy bookkeeping); the upturn at d=50 shows the O(d) matrix-vector cost beginning to dominate. Right: iterations-to-convergence rises only modestly across two decades of d (219 \to 238). This near-invariance is expected: \kappa(I_d)=1 regardless of dimension, so the contraction factor \rho=|1-\alpha|=0.9 is identical for every d, and only the per-coordinate residual norm grows mildly." title="" id="84" name="Picture"/>
+            <wp:docPr descr="Figure 5: Dimensional scaling from generate_benchmark_visualization(). Dimensions d \in \{1, 2, 5, 10, 20, 50\} run on identity-Hessian quadratics with \alpha=0.1 and gradient tolerance 10^{-10} (both hardcoded in the script for benchmark stability). Left: mean wall-clock time per gradient_descent() call (μs). The flat regime at d \leq 20 reflects per-iteration overhead (Python dispatch, NumPy bookkeeping); the upturn at d=50 shows the O(d) matrix-vector cost beginning to dominate. Right: iterations-to-convergence rises only modestly across two decades of d (219 \to 238). This near-invariance is expected: \kappa(I_d)=1 regardless of dimension, so the contraction factor \rho=|1-\alpha|=0.9 is identical for every d, and only the per-coordinate residual norm grows mildly." title="" id="83" name="Picture"/>
             <a:graphic>
               <a:graphicData uri="http://schemas.openxmlformats.org/drawingml/2006/picture">
                 <pic:pic>
                   <pic:nvPicPr>
-                    <pic:cNvPr descr="../figures/performance_benchmark.png" id="85" name="Picture"/>
+                    <pic:cNvPr descr="../figures/performance_benchmark.png" id="84" name="Picture"/>
                     <pic:cNvPicPr>
                       <a:picLocks noChangeArrowheads="1" noChangeAspect="1"/>
                     </pic:cNvPicPr>
                   </pic:nvPicPr>
                   <pic:blipFill>
-                    <a:blip r:embed="rId83"/>
+                    <a:blip r:embed="rId82"/>
                     <a:stretch>
                       <a:fillRect/>
                     </a:stretch>
@@ -10127,9 +10149,9 @@
         <w:t xml:space="preserve">, and only the per-coordinate residual norm grows mildly.</w:t>
       </w:r>
     </w:p>
+    <w:bookmarkEnd w:id="85"/>
     <w:bookmarkEnd w:id="86"/>
-    <w:bookmarkEnd w:id="87"/>
-    <w:bookmarkStart w:id="92" w:name="numerical-stability-analysis-1"/>
+    <w:bookmarkStart w:id="91" w:name="numerical-stability-analysis-1"/>
     <w:p>
       <w:pPr>
         <w:pStyle w:val="Heading3"/>
@@ -10276,7 +10298,7 @@
         <w:t xml:space="preserve">across the parameter space.</w:t>
       </w:r>
     </w:p>
-    <w:bookmarkStart w:id="91" w:name="fig:stability"/>
+    <w:bookmarkStart w:id="90" w:name="fig:stability"/>
     <w:p>
       <w:pPr>
         <w:pStyle w:val="CaptionedFigure"/>
@@ -10286,18 +10308,18 @@
           <wp:inline>
             <wp:extent cx="5334000" cy="2063527"/>
             <wp:effectExtent b="0" l="0" r="0" t="0"/>
-            <wp:docPr descr="Figure 6: Numerical stability heatmap from generate_stability_visualization(). Each cell shows \log_{10}|f(x)-f(x^\ast)| at termination for one (starting point x_0, step size \alpha) combination, evaluated by gradient_descent() over the 8-by-6 grid (48 cells). The leftmost column (\alpha=0.01, conservative) reaches only 10^{-6} to 10^{-9} within the iteration cap, while every other column saturates at machine precision (10^{-16}) regardless of how far x_0 starts from the optimum (range [-50, 50]). The right panel summarises this uniformity as the aggregate stability score of 1.00/1.00 returned by infrastructure.scientific.stability.check_numerical_stability(), which exercises the same objective with extreme inputs (NaN, \pm\infty, \pm 10^{10})." title="" id="89" name="Picture"/>
+            <wp:docPr descr="Figure 6: Numerical stability heatmap from generate_stability_visualization(). Each cell shows \log_{10}|f(x)-f(x^\ast)| at termination for one (starting point x_0, step size \alpha) combination, evaluated by gradient_descent() over the 8-by-6 grid (48 cells). The leftmost column (\alpha=0.01, conservative) reaches only 10^{-6} to 10^{-9} within the iteration cap, while every other column saturates at machine precision (10^{-16}) regardless of how far x_0 starts from the optimum (range [-50, 50]). The right panel summarises this uniformity as the aggregate stability score of 1.00/1.00 returned by infrastructure.scientific.stability.check_numerical_stability(), which exercises the same objective with extreme inputs (NaN, \pm\infty, \pm 10^{10})." title="" id="88" name="Picture"/>
             <a:graphic>
               <a:graphicData uri="http://schemas.openxmlformats.org/drawingml/2006/picture">
                 <pic:pic>
                   <pic:nvPicPr>
-                    <pic:cNvPr descr="../figures/stability_analysis.png" id="90" name="Picture"/>
+                    <pic:cNvPr descr="../figures/stability_analysis.png" id="89" name="Picture"/>
                     <pic:cNvPicPr>
                       <a:picLocks noChangeArrowheads="1" noChangeAspect="1"/>
                     </pic:cNvPicPr>
                   </pic:nvPicPr>
                   <pic:blipFill>
-                    <a:blip r:embed="rId88"/>
+                    <a:blip r:embed="rId87"/>
                     <a:stretch>
                       <a:fillRect/>
                     </a:stretch>
@@ -10699,9 +10721,9 @@
         <w:t xml:space="preserve">).</w:t>
       </w:r>
     </w:p>
+    <w:bookmarkEnd w:id="90"/>
     <w:bookmarkEnd w:id="91"/>
-    <w:bookmarkEnd w:id="92"/>
-    <w:bookmarkStart w:id="93" w:name="performance-metrics-summary"/>
+    <w:bookmarkStart w:id="92" w:name="performance-metrics-summary"/>
     <w:p>
       <w:pPr>
         <w:pStyle w:val="Heading3"/>
@@ -10911,9 +10933,9 @@
         <w:t xml:space="preserve">achieved for converged cases</w:t>
       </w:r>
     </w:p>
+    <w:bookmarkEnd w:id="92"/>
     <w:bookmarkEnd w:id="93"/>
-    <w:bookmarkEnd w:id="94"/>
-    <w:bookmarkStart w:id="95" w:name="validation"/>
+    <w:bookmarkStart w:id="94" w:name="validation"/>
     <w:p>
       <w:pPr>
         <w:pStyle w:val="Heading2"/>
@@ -11055,8 +11077,8 @@
         <w:t xml:space="preserve">All tests pass with coverage exceeding the 90% threshold, ensuring implementation correctness across core logic, convergence detection, and logging pathways without the use of mocks.</w:t>
       </w:r>
     </w:p>
-    <w:bookmarkEnd w:id="95"/>
-    <w:bookmarkStart w:id="96" w:name="discussion"/>
+    <w:bookmarkEnd w:id="94"/>
+    <w:bookmarkStart w:id="95" w:name="discussion"/>
     <w:p>
       <w:pPr>
         <w:pStyle w:val="Heading2"/>
@@ -11177,9 +11199,9 @@
         <w:t xml:space="preserve">module handling the Pandoc conversion.</w:t>
       </w:r>
     </w:p>
+    <w:bookmarkEnd w:id="95"/>
     <w:bookmarkEnd w:id="96"/>
-    <w:bookmarkEnd w:id="97"/>
-    <w:bookmarkStart w:id="106" w:name="sec:conclusion"/>
+    <w:bookmarkStart w:id="105" w:name="sec:conclusion"/>
     <w:p>
       <w:pPr>
         <w:pStyle w:val="Heading1"/>
@@ -11196,7 +11218,7 @@
         <w:t xml:space="preserve">This study demonstrated a complete computational research pipeline from algorithmic implementation through uncompromising testing, automated analysis, and zero-intervention manuscript generation. Ultimately, it validates the proposition that high-quality mathematical research software benefits from production-tier engineering practices.</w:t>
       </w:r>
     </w:p>
-    <w:bookmarkStart w:id="98" w:name="exemplar-project-achievements"/>
+    <w:bookmarkStart w:id="97" w:name="exemplar-project-achievements"/>
     <w:p>
       <w:pPr>
         <w:pStyle w:val="Heading2"/>
@@ -11315,8 +11337,8 @@
         <w:t xml:space="preserve">: Adhered structurally to the RASP methodology, producing verified, accessible output spanning from documentation indices to the final LLM-assisted publication configurations.</w:t>
       </w:r>
     </w:p>
-    <w:bookmarkEnd w:id="98"/>
-    <w:bookmarkStart w:id="101" w:name="technical-contributions"/>
+    <w:bookmarkEnd w:id="97"/>
+    <w:bookmarkStart w:id="100" w:name="technical-contributions"/>
     <w:p>
       <w:pPr>
         <w:pStyle w:val="Heading2"/>
@@ -11325,7 +11347,7 @@
         <w:t xml:space="preserve">Technical Contributions</w:t>
       </w:r>
     </w:p>
-    <w:bookmarkStart w:id="99" w:name="test-coverage-strategy"/>
+    <w:bookmarkStart w:id="98" w:name="test-coverage-strategy"/>
     <w:p>
       <w:pPr>
         <w:pStyle w:val="Heading3"/>
@@ -11378,8 +11400,8 @@
         <w:t xml:space="preserve">CI/CD validation gates requiring ≥90% statement coverage before progression.</w:t>
       </w:r>
     </w:p>
-    <w:bookmarkEnd w:id="99"/>
-    <w:bookmarkStart w:id="100" w:name="infrastructure-backed-capabilities"/>
+    <w:bookmarkEnd w:id="98"/>
+    <w:bookmarkStart w:id="99" w:name="infrastructure-backed-capabilities"/>
     <w:p>
       <w:pPr>
         <w:pStyle w:val="Heading3"/>
@@ -11550,9 +11572,9 @@
         <w:t xml:space="preserve">.</w:t>
       </w:r>
     </w:p>
+    <w:bookmarkEnd w:id="99"/>
     <w:bookmarkEnd w:id="100"/>
-    <w:bookmarkEnd w:id="101"/>
-    <w:bookmarkStart w:id="102" w:name="research-pipeline-validation"/>
+    <w:bookmarkStart w:id="101" w:name="research-pipeline-validation"/>
     <w:p>
       <w:pPr>
         <w:pStyle w:val="Heading2"/>
@@ -11645,8 +11667,8 @@
         <w:t xml:space="preserve">: LLM integration analyzing output completeness contextually without degrading hermetic logic.</w:t>
       </w:r>
     </w:p>
-    <w:bookmarkEnd w:id="102"/>
-    <w:bookmarkStart w:id="103" w:name="key-insights"/>
+    <w:bookmarkEnd w:id="101"/>
+    <w:bookmarkStart w:id="102" w:name="key-insights"/>
     <w:p>
       <w:pPr>
         <w:pStyle w:val="Heading2"/>
@@ -11736,8 +11758,8 @@
         <w:t xml:space="preserve">: Re-compiling the pipeline enforces an immutable bond between algorithm version and final visual reporting.</w:t>
       </w:r>
     </w:p>
-    <w:bookmarkEnd w:id="103"/>
-    <w:bookmarkStart w:id="104" w:name="future-extensions"/>
+    <w:bookmarkEnd w:id="102"/>
+    <w:bookmarkStart w:id="103" w:name="future-extensions"/>
     <w:p>
       <w:pPr>
         <w:pStyle w:val="Heading2"/>
@@ -11851,14 +11873,146 @@
         <w:t xml:space="preserve">to analyze novel model interactions automatically.</w:t>
       </w:r>
     </w:p>
+    <w:bookmarkEnd w:id="103"/>
+    <w:bookmarkStart w:id="104" w:name="final-assessment"/>
+    <w:p>
+      <w:pPr>
+        <w:pStyle w:val="Heading2"/>
+      </w:pPr>
+      <w:r>
+        <w:t xml:space="preserve">Final Assessment</w:t>
+      </w:r>
+    </w:p>
+    <w:p>
+      <w:pPr>
+        <w:pStyle w:val="FirstParagraph"/>
+      </w:pPr>
+      <w:r>
+        <w:t xml:space="preserve">This work demonstrates that the research template supports projects spanning the full spectrum—from prose-focused manuscripts to fully-tested algorithmic ecosystems. The optimization exemplar ties every quantitative claim to</w:t>
+      </w:r>
+      <w:r>
+        <w:t xml:space="preserve"> </w:t>
+      </w:r>
+      <w:r>
+        <w:rPr>
+          <w:rStyle w:val="VerbatimChar"/>
+        </w:rPr>
+        <w:t xml:space="preserve">output/data/</w:t>
+      </w:r>
+      <w:r>
+        <w:t xml:space="preserve"> </w:t>
+      </w:r>
+      <w:r>
+        <w:t xml:space="preserve">artifacts and enforces a zero-mock test policy on</w:t>
+      </w:r>
+      <w:r>
+        <w:t xml:space="preserve"> </w:t>
+      </w:r>
+      <w:r>
+        <w:rPr>
+          <w:rStyle w:val="VerbatimChar"/>
+        </w:rPr>
+        <w:t xml:space="preserve">projects/templates/template_code_project/src/</w:t>
+      </w:r>
+      <w:r>
+        <w:t xml:space="preserve"> </w:t>
+      </w:r>
+      <w:r>
+        <w:t xml:space="preserve">with coverage gates documented in the root</w:t>
+      </w:r>
+      <w:r>
+        <w:t xml:space="preserve"> </w:t>
+      </w:r>
+      <w:r>
+        <w:rPr>
+          <w:rStyle w:val="VerbatimChar"/>
+        </w:rPr>
+        <w:t xml:space="preserve">pyproject.toml</w:t>
+      </w:r>
+      <w:r>
+        <w:t xml:space="preserve">.</w:t>
+      </w:r>
+    </w:p>
+    <w:p>
+      <w:pPr>
+        <w:pStyle w:val="BodyText"/>
+      </w:pPr>
+      <w:r>
+        <w:t xml:space="preserve">The pipeline produced the figures referenced in sec. 4, wrote</w:t>
+      </w:r>
+      <w:r>
+        <w:t xml:space="preserve"> </w:t>
+      </w:r>
+      <w:r>
+        <w:rPr>
+          <w:rStyle w:val="VerbatimChar"/>
+        </w:rPr>
+        <w:t xml:space="preserve">optimization_results.csv</w:t>
+      </w:r>
+      <w:r>
+        <w:t xml:space="preserve">, and rendered this markdown (</w:t>
+      </w:r>
+      <w:r>
+        <w:rPr>
+          <w:rStyle w:val="VerbatimChar"/>
+        </w:rPr>
+        <w:t xml:space="preserve">projects/templates/template_code_project/manuscript/04_conclusion.md</w:t>
+      </w:r>
+      <w:r>
+        <w:t xml:space="preserve">) together with</w:t>
+      </w:r>
+      <w:r>
+        <w:t xml:space="preserve"> </w:t>
+      </w:r>
+      <w:r>
+        <w:rPr>
+          <w:rStyle w:val="VerbatimChar"/>
+        </w:rPr>
+        <w:t xml:space="preserve">config.yaml</w:t>
+      </w:r>
+      <w:r>
+        <w:t xml:space="preserve"> </w:t>
+      </w:r>
+      <w:r>
+        <w:t xml:space="preserve">into PDF through</w:t>
+      </w:r>
+      <w:r>
+        <w:t xml:space="preserve"> </w:t>
+      </w:r>
+      <w:r>
+        <w:rPr>
+          <w:rStyle w:val="VerbatimChar"/>
+        </w:rPr>
+        <w:t xml:space="preserve">infrastructure.rendering</w:t>
+      </w:r>
+      <w:r>
+        <w:t xml:space="preserve">. The</w:t>
+      </w:r>
+      <w:r>
+        <w:t xml:space="preserve"> </w:t>
+      </w:r>
+      <w:r>
+        <w:rPr>
+          <w:rStyle w:val="VerbatimChar"/>
+        </w:rPr>
+        <w:t xml:space="preserve">template_code_project</w:t>
+      </w:r>
+      <w:r>
+        <w:t xml:space="preserve"> </w:t>
+      </w:r>
+      <w:r>
+        <w:t xml:space="preserve">tree remains the canonical reference for how algorithm code, analysis scripts, variable injection, and manuscript stay synchronized across rebuilds.</w:t>
+      </w:r>
+    </w:p>
     <w:bookmarkEnd w:id="104"/>
-    <w:bookmarkStart w:id="105" w:name="final-assessment"/>
-    <w:p>
-      <w:pPr>
-        <w:pStyle w:val="Heading2"/>
-      </w:pPr>
-      <w:r>
-        <w:t xml:space="preserve">Final Assessment</w:t>
+    <w:bookmarkEnd w:id="105"/>
+    <w:bookmarkStart w:id="113" w:name="sec:experimental_setup"/>
+    <w:p>
+      <w:pPr>
+        <w:pStyle w:val="Heading1"/>
+      </w:pPr>
+      <w:r>
+        <w:t xml:space="preserve">Experimental Setup</w:t>
       </w:r>
     </w:p>
     <w:p>
@@ -11866,78 +12020,7 @@
         <w:pStyle w:val="FirstParagraph"/>
       </w:pPr>
       <w:r>
-        <w:t xml:space="preserve">This work demonstrates that the research template supports projects spanning the full spectrum—from prose-focused manuscripts to fully-tested algorithmic ecosystems. The optimization exemplar ties every quantitative claim to</w:t>
-      </w:r>
-      <w:r>
-        <w:t xml:space="preserve"> </w:t>
-      </w:r>
-      <w:r>
-        <w:rPr>
-          <w:rStyle w:val="VerbatimChar"/>
-        </w:rPr>
-        <w:t xml:space="preserve">output/data/</w:t>
-      </w:r>
-      <w:r>
-        <w:t xml:space="preserve"> </w:t>
-      </w:r>
-      <w:r>
-        <w:t xml:space="preserve">artifacts and enforces a zero-mock test policy on</w:t>
-      </w:r>
-      <w:r>
-        <w:t xml:space="preserve"> </w:t>
-      </w:r>
-      <w:r>
-        <w:rPr>
-          <w:rStyle w:val="VerbatimChar"/>
-        </w:rPr>
-        <w:t xml:space="preserve">projects/templates/template_code_project/src/</w:t>
-      </w:r>
-      <w:r>
-        <w:t xml:space="preserve"> </w:t>
-      </w:r>
-      <w:r>
-        <w:t xml:space="preserve">with coverage gates documented in the root</w:t>
-      </w:r>
-      <w:r>
-        <w:t xml:space="preserve"> </w:t>
-      </w:r>
-      <w:r>
-        <w:rPr>
-          <w:rStyle w:val="VerbatimChar"/>
-        </w:rPr>
-        <w:t xml:space="preserve">pyproject.toml</w:t>
-      </w:r>
-      <w:r>
-        <w:t xml:space="preserve">.</w:t>
-      </w:r>
-    </w:p>
-    <w:p>
-      <w:pPr>
-        <w:pStyle w:val="BodyText"/>
-      </w:pPr>
-      <w:r>
-        <w:t xml:space="preserve">The pipeline produced the figures referenced in sec. 4, wrote</w:t>
-      </w:r>
-      <w:r>
-        <w:t xml:space="preserve"> </w:t>
-      </w:r>
-      <w:r>
-        <w:rPr>
-          <w:rStyle w:val="VerbatimChar"/>
-        </w:rPr>
-        <w:t xml:space="preserve">optimization_results.csv</w:t>
-      </w:r>
-      <w:r>
-        <w:t xml:space="preserve">, and rendered this markdown (</w:t>
-      </w:r>
-      <w:r>
-        <w:rPr>
-          <w:rStyle w:val="VerbatimChar"/>
-        </w:rPr>
-        <w:t xml:space="preserve">projects/templates/template_code_project/manuscript/04_conclusion.md</w:t>
-      </w:r>
-      <w:r>
-        <w:t xml:space="preserve">) together with</w:t>
+        <w:t xml:space="preserve">This section details the complete experimental configuration used to generate the results in this study. Every parameter value below is injected programmatically from</w:t>
       </w:r>
       <w:r>
         <w:t xml:space="preserve"> </w:t>
@@ -11952,71 +12035,10 @@
         <w:t xml:space="preserve"> </w:t>
       </w:r>
       <w:r>
-        <w:t xml:space="preserve">into PDF through</w:t>
-      </w:r>
-      <w:r>
-        <w:t xml:space="preserve"> </w:t>
-      </w:r>
-      <w:r>
-        <w:rPr>
-          <w:rStyle w:val="VerbatimChar"/>
-        </w:rPr>
-        <w:t xml:space="preserve">infrastructure.rendering</w:t>
-      </w:r>
-      <w:r>
-        <w:t xml:space="preserve">. The</w:t>
-      </w:r>
-      <w:r>
-        <w:t xml:space="preserve"> </w:t>
-      </w:r>
-      <w:r>
-        <w:rPr>
-          <w:rStyle w:val="VerbatimChar"/>
-        </w:rPr>
-        <w:t xml:space="preserve">template_code_project</w:t>
-      </w:r>
-      <w:r>
-        <w:t xml:space="preserve"> </w:t>
-      </w:r>
-      <w:r>
-        <w:t xml:space="preserve">tree remains the canonical reference for how algorithm code, analysis scripts, variable injection, and manuscript stay synchronized across rebuilds.</w:t>
-      </w:r>
-    </w:p>
-    <w:bookmarkEnd w:id="105"/>
-    <w:bookmarkEnd w:id="106"/>
-    <w:bookmarkStart w:id="114" w:name="sec:experimental_setup"/>
-    <w:p>
-      <w:pPr>
-        <w:pStyle w:val="Heading1"/>
-      </w:pPr>
-      <w:r>
-        <w:t xml:space="preserve">Experimental Setup</w:t>
-      </w:r>
-    </w:p>
-    <w:p>
-      <w:pPr>
-        <w:pStyle w:val="FirstParagraph"/>
-      </w:pPr>
-      <w:r>
-        <w:t xml:space="preserve">This section details the complete experimental configuration used to generate the results in this study. Every parameter value below is injected programmatically from</w:t>
-      </w:r>
-      <w:r>
-        <w:t xml:space="preserve"> </w:t>
-      </w:r>
-      <w:r>
-        <w:rPr>
-          <w:rStyle w:val="VerbatimChar"/>
-        </w:rPr>
-        <w:t xml:space="preserve">config.yaml</w:t>
-      </w:r>
-      <w:r>
-        <w:t xml:space="preserve"> </w:t>
-      </w:r>
-      <w:r>
         <w:t xml:space="preserve">and the analysis pipeline — no value is hardcoded in the manuscript source.</w:t>
       </w:r>
     </w:p>
-    <w:bookmarkStart w:id="107" w:name="problem-definition"/>
+    <w:bookmarkStart w:id="106" w:name="problem-definition"/>
     <w:p>
       <w:pPr>
         <w:pStyle w:val="Heading2"/>
@@ -12229,8 +12251,8 @@
         <w:t xml:space="preserve">.</w:t>
       </w:r>
     </w:p>
-    <w:bookmarkEnd w:id="107"/>
-    <w:bookmarkStart w:id="108" w:name="parameter-space"/>
+    <w:bookmarkEnd w:id="106"/>
+    <w:bookmarkStart w:id="107" w:name="parameter-space"/>
     <w:p>
       <w:pPr>
         <w:pStyle w:val="Heading2"/>
@@ -12549,53 +12571,53 @@
         <w:t xml:space="preserve">.</w:t>
       </w:r>
     </w:p>
+    <w:bookmarkEnd w:id="107"/>
+    <w:bookmarkStart w:id="108" w:name="numerical-stability-grid"/>
+    <w:p>
+      <w:pPr>
+        <w:pStyle w:val="Heading2"/>
+      </w:pPr>
+      <w:r>
+        <w:t xml:space="preserve">Numerical Stability Grid</w:t>
+      </w:r>
+    </w:p>
+    <w:p>
+      <w:pPr>
+        <w:pStyle w:val="FirstParagraph"/>
+      </w:pPr>
+      <w:r>
+        <w:t xml:space="preserve">To validate robustness, the optimizer is exercised across a grid of 8 starting points and 6 step sizes, producing 48 total evaluations. This comprehensive sweep confirms that convergence is not an artifact of a narrow parameter choice. The stability metric is computed for the</w:t>
+      </w:r>
+      <w:r>
+        <w:t xml:space="preserve"> </w:t>
+      </w:r>
+      <w:r>
+        <w:rPr>
+          <w:rStyle w:val="VerbatimChar"/>
+        </w:rPr>
+        <w:t xml:space="preserve">quadratic_function</w:t>
+      </w:r>
+      <w:r>
+        <w:t xml:space="preserve"> </w:t>
+      </w:r>
+      <w:r>
+        <w:t xml:space="preserve">objective via</w:t>
+      </w:r>
+      <w:r>
+        <w:t xml:space="preserve"> </w:t>
+      </w:r>
+      <w:r>
+        <w:rPr>
+          <w:rStyle w:val="VerbatimChar"/>
+        </w:rPr>
+        <w:t xml:space="preserve">infrastructure.scientific.stability.check_numerical_stability()</w:t>
+      </w:r>
+      <w:r>
+        <w:t xml:space="preserve">.</w:t>
+      </w:r>
+    </w:p>
     <w:bookmarkEnd w:id="108"/>
-    <w:bookmarkStart w:id="109" w:name="numerical-stability-grid"/>
-    <w:p>
-      <w:pPr>
-        <w:pStyle w:val="Heading2"/>
-      </w:pPr>
-      <w:r>
-        <w:t xml:space="preserve">Numerical Stability Grid</w:t>
-      </w:r>
-    </w:p>
-    <w:p>
-      <w:pPr>
-        <w:pStyle w:val="FirstParagraph"/>
-      </w:pPr>
-      <w:r>
-        <w:t xml:space="preserve">To validate robustness, the optimizer is exercised across a grid of 8 starting points and 6 step sizes, producing 48 total evaluations. This comprehensive sweep confirms that convergence is not an artifact of a narrow parameter choice. The stability metric is computed for the</w:t>
-      </w:r>
-      <w:r>
-        <w:t xml:space="preserve"> </w:t>
-      </w:r>
-      <w:r>
-        <w:rPr>
-          <w:rStyle w:val="VerbatimChar"/>
-        </w:rPr>
-        <w:t xml:space="preserve">quadratic_function</w:t>
-      </w:r>
-      <w:r>
-        <w:t xml:space="preserve"> </w:t>
-      </w:r>
-      <w:r>
-        <w:t xml:space="preserve">objective via</w:t>
-      </w:r>
-      <w:r>
-        <w:t xml:space="preserve"> </w:t>
-      </w:r>
-      <w:r>
-        <w:rPr>
-          <w:rStyle w:val="VerbatimChar"/>
-        </w:rPr>
-        <w:t xml:space="preserve">infrastructure.scientific.stability.check_numerical_stability()</w:t>
-      </w:r>
-      <w:r>
-        <w:t xml:space="preserve">.</w:t>
-      </w:r>
-    </w:p>
-    <w:bookmarkEnd w:id="109"/>
-    <w:bookmarkStart w:id="110" w:name="dimensional-scaling"/>
+    <w:bookmarkStart w:id="109" w:name="dimensional-scaling"/>
     <w:p>
       <w:pPr>
         <w:pStyle w:val="Heading2"/>
@@ -12730,7 +12752,7 @@
           <w:b/>
           <w:bCs/>
         </w:rPr>
-        <w:t xml:space="preserve">2.8 μs</w:t>
+        <w:t xml:space="preserve">1.9 μs</w:t>
       </w:r>
       <w:r>
         <w:t xml:space="preserve"> </w:t>
@@ -12751,8 +12773,8 @@
         <w:t xml:space="preserve">).</w:t>
       </w:r>
     </w:p>
-    <w:bookmarkEnd w:id="110"/>
-    <w:bookmarkStart w:id="111" w:name="computational-environment"/>
+    <w:bookmarkEnd w:id="109"/>
+    <w:bookmarkStart w:id="110" w:name="computational-environment"/>
     <w:p>
       <w:pPr>
         <w:pStyle w:val="Heading2"/>
@@ -12796,7 +12818,7 @@
         <w:t xml:space="preserve">NumPy</w:t>
       </w:r>
       <w:r>
-        <w:t xml:space="preserve">: 2.4.1</w:t>
+        <w:t xml:space="preserve">: 2.4.2</w:t>
       </w:r>
     </w:p>
     <w:p>
@@ -12834,11 +12856,11 @@
         <w:t xml:space="preserve">Generated</w:t>
       </w:r>
       <w:r>
-        <w:t xml:space="preserve">: 2026-06-26T13:57:11Z</w:t>
-      </w:r>
-    </w:p>
-    <w:bookmarkEnd w:id="111"/>
-    <w:bookmarkStart w:id="112" w:name="pipeline-ordering"/>
+        <w:t xml:space="preserve">: 2026-06-30T12:08:00Z</w:t>
+      </w:r>
+    </w:p>
+    <w:bookmarkEnd w:id="110"/>
+    <w:bookmarkStart w:id="111" w:name="pipeline-ordering"/>
     <w:p>
       <w:pPr>
         <w:pStyle w:val="Heading2"/>
@@ -13034,8 +13056,8 @@
         <w:t xml:space="preserve">so that figure paths and numeric tables match the analysis that just completed.</w:t>
       </w:r>
     </w:p>
-    <w:bookmarkEnd w:id="112"/>
-    <w:bookmarkStart w:id="113" w:name="relation-to-figures"/>
+    <w:bookmarkEnd w:id="111"/>
+    <w:bookmarkStart w:id="112" w:name="relation-to-figures"/>
     <w:p>
       <w:pPr>
         <w:pStyle w:val="Heading2"/>
@@ -13387,8 +13409,8 @@
         <w:t xml:space="preserve">This table is descriptive documentation only; it is not executed as code during the build.</w:t>
       </w:r>
     </w:p>
+    <w:bookmarkEnd w:id="112"/>
     <w:bookmarkEnd w:id="113"/>
-    <w:bookmarkEnd w:id="114"/>
     <w:bookmarkStart w:id="121" w:name="sec:reproducibility"/>
     <w:p>
       <w:pPr>
@@ -13406,7 +13428,7 @@
         <w:t xml:space="preserve">This section provides a machine-verifiable reproducibility certificate for the complete study. Every metric below is computed by the analysis pipeline and injected into the manuscript at render time — establishing a cryptographic chain of custody from configuration to publication.</w:t>
       </w:r>
     </w:p>
-    <w:bookmarkStart w:id="115" w:name="configuration-provenance"/>
+    <w:bookmarkStart w:id="114" w:name="configuration-provenance"/>
     <w:p>
       <w:pPr>
         <w:pStyle w:val="Heading2"/>
@@ -13576,8 +13598,8 @@
         <w:t xml:space="preserve">is modified, ensuring that every rendered PDF is traceable to a specific configuration state.</w:t>
       </w:r>
     </w:p>
-    <w:bookmarkEnd w:id="115"/>
-    <w:bookmarkStart w:id="116" w:name="generated-artifact-registry"/>
+    <w:bookmarkEnd w:id="114"/>
+    <w:bookmarkStart w:id="115" w:name="generated-artifact-registry"/>
     <w:p>
       <w:pPr>
         <w:pStyle w:val="Heading2"/>
@@ -13686,7 +13708,7 @@
               <w:pStyle w:val="Compact"/>
             </w:pPr>
             <w:r>
-              <w:t xml:space="preserve">6</w:t>
+              <w:t xml:space="preserve">5</w:t>
             </w:r>
           </w:p>
         </w:tc>
@@ -13710,7 +13732,7 @@
               <w:pStyle w:val="Compact"/>
             </w:pPr>
             <w:r>
-              <w:t xml:space="preserve">22</w:t>
+              <w:t xml:space="preserve">9</w:t>
             </w:r>
           </w:p>
         </w:tc>
@@ -13742,13 +13764,13 @@
                 <w:b/>
                 <w:bCs/>
               </w:rPr>
-              <w:t xml:space="preserve">36</w:t>
+              <w:t xml:space="preserve">22</w:t>
             </w:r>
           </w:p>
         </w:tc>
       </w:tr>
     </w:tbl>
-    <w:bookmarkEnd w:id="116"/>
+    <w:bookmarkEnd w:id="115"/>
     <w:bookmarkStart w:id="119" w:name="numerical-validation-summary"/>
     <w:p>
       <w:pPr>
@@ -13758,7 +13780,7 @@
         <w:t xml:space="preserve">Numerical Validation Summary</w:t>
       </w:r>
     </w:p>
-    <w:bookmarkStart w:id="117" w:name="convergence-verification"/>
+    <w:bookmarkStart w:id="116" w:name="convergence-verification"/>
     <w:p>
       <w:pPr>
         <w:pStyle w:val="Heading3"/>
@@ -13949,8 +13971,8 @@
         <w:t xml:space="preserve">Mean iterations across all rows: 372</w:t>
       </w:r>
     </w:p>
-    <w:bookmarkEnd w:id="117"/>
-    <w:bookmarkStart w:id="118" w:name="numerical-stability"/>
+    <w:bookmarkEnd w:id="116"/>
+    <w:bookmarkStart w:id="117" w:name="numerical-stability"/>
     <w:p>
       <w:pPr>
         <w:pStyle w:val="Heading3"/>
@@ -14018,6 +14040,135 @@
       </w:r>
       <w:r>
         <w:t xml:space="preserve">6 step sizes), confirming uniform convergence across the entire parameter space.</w:t>
+      </w:r>
+    </w:p>
+    <w:bookmarkEnd w:id="117"/>
+    <w:bookmarkStart w:id="118" w:name="benchmark-demonstration"/>
+    <w:p>
+      <w:pPr>
+        <w:pStyle w:val="Heading3"/>
+      </w:pPr>
+      <w:r>
+        <w:t xml:space="preserve">Benchmark Demonstration</w:t>
+      </w:r>
+    </w:p>
+    <w:p>
+      <w:pPr>
+        <w:pStyle w:val="FirstParagraph"/>
+      </w:pPr>
+      <w:r>
+        <w:t xml:space="preserve">This exemplar also demonstrates</w:t>
+      </w:r>
+      <w:r>
+        <w:t xml:space="preserve"> </w:t>
+      </w:r>
+      <w:r>
+        <w:rPr>
+          <w:rStyle w:val="VerbatimChar"/>
+        </w:rPr>
+        <w:t xml:space="preserve">infrastructure.benchmark</w:t>
+      </w:r>
+      <w:r>
+        <w:t xml:space="preserve">. The thin orchestrator</w:t>
+      </w:r>
+      <w:r>
+        <w:t xml:space="preserve"> </w:t>
+      </w:r>
+      <w:r>
+        <w:rPr>
+          <w:rStyle w:val="VerbatimChar"/>
+        </w:rPr>
+        <w:t xml:space="preserve">scripts/04_benchmark_stage.py</w:t>
+      </w:r>
+      <w:r>
+        <w:t xml:space="preserve"> </w:t>
+      </w:r>
+      <w:r>
+        <w:t xml:space="preserve">calls</w:t>
+      </w:r>
+      <w:r>
+        <w:t xml:space="preserve"> </w:t>
+      </w:r>
+      <w:r>
+        <w:rPr>
+          <w:rStyle w:val="VerbatimChar"/>
+        </w:rPr>
+        <w:t xml:space="preserve">src/benchmark_support.py</w:t>
+      </w:r>
+      <w:r>
+        <w:t xml:space="preserve">, which times the pure</w:t>
+      </w:r>
+      <w:r>
+        <w:t xml:space="preserve"> </w:t>
+      </w:r>
+      <w:r>
+        <w:rPr>
+          <w:rStyle w:val="VerbatimChar"/>
+        </w:rPr>
+        <w:t xml:space="preserve">quadratic_function</w:t>
+      </w:r>
+      <w:r>
+        <w:t xml:space="preserve"> </w:t>
+      </w:r>
+      <w:r>
+        <w:t xml:space="preserve">across a fixed set of input sizes (deterministic seed, no network) and turns the timing facts into boolean rubric checks. Those checks are scored through the shared</w:t>
+      </w:r>
+      <w:r>
+        <w:t xml:space="preserve"> </w:t>
+      </w:r>
+      <w:r>
+        <w:rPr>
+          <w:rStyle w:val="VerbatimChar"/>
+        </w:rPr>
+        <w:t xml:space="preserve">infrastructure.benchmark.score_rubric</w:t>
+      </w:r>
+      <w:r>
+        <w:t xml:space="preserve"> </w:t>
+      </w:r>
+      <w:r>
+        <w:t xml:space="preserve">against a weighted</w:t>
+      </w:r>
+      <w:r>
+        <w:t xml:space="preserve"> </w:t>
+      </w:r>
+      <w:r>
+        <w:rPr>
+          <w:rStyle w:val="VerbatimChar"/>
+        </w:rPr>
+        <w:t xml:space="preserve">RubricSet</w:t>
+      </w:r>
+      <w:r>
+        <w:t xml:space="preserve">, and the result is rendered with</w:t>
+      </w:r>
+      <w:r>
+        <w:t xml:space="preserve"> </w:t>
+      </w:r>
+      <w:r>
+        <w:rPr>
+          <w:rStyle w:val="VerbatimChar"/>
+        </w:rPr>
+        <w:t xml:space="preserve">scores_to_markdown</w:t>
+      </w:r>
+      <w:r>
+        <w:t xml:space="preserve"> </w:t>
+      </w:r>
+      <w:r>
+        <w:t xml:space="preserve">into</w:t>
+      </w:r>
+      <w:r>
+        <w:t xml:space="preserve"> </w:t>
+      </w:r>
+      <w:r>
+        <w:rPr>
+          <w:rStyle w:val="VerbatimChar"/>
+        </w:rPr>
+        <w:t xml:space="preserve">output/reports/benchmark_report.json</w:t>
+      </w:r>
+      <w:r>
+        <w:t xml:space="preserve"> </w:t>
+      </w:r>
+      <w:r>
+        <w:t xml:space="preserve">(plus an optional timing figure). This keeps the benchmark API exercised by a real exemplar, not by infrastructure tests alone.</w:t>
       </w:r>
     </w:p>
     <w:bookmarkEnd w:id="118"/>
@@ -14878,13 +15029,13 @@
         <w:rPr>
           <w:rStyle w:val="VerbatimChar"/>
         </w:rPr>
-        <w:t xml:space="preserve">cd54b9589350…</w:t>
-      </w:r>
-      <w:r>
-        <w:t xml:space="preserve"> </w:t>
-      </w:r>
-      <w:r>
-        <w:t xml:space="preserve">· pairing complete</w:t>
+        <w:t xml:space="preserve">pending…</w:t>
+      </w:r>
+      <w:r>
+        <w:t xml:space="preserve"> </w:t>
+      </w:r>
+      <w:r>
+        <w:t xml:space="preserve">· pairing pending</w:t>
       </w:r>
     </w:p>
     <w:p>
@@ -14907,7 +15058,7 @@
                     </pic:cNvPicPr>
                   </pic:nvPicPr>
                   <pic:blipFill>
-                    <a:blip r:embed="rId11"/>
+                    <a:blip r:embed="rId10"/>
                     <a:stretch>
                       <a:fillRect/>
                     </a:stretch>
@@ -14958,39 +15109,10 @@
       </w:r>
       <w:r>
         <w:rPr>
-          <w:rStyle w:val="VerbatimChar"/>
-        </w:rPr>
-        <w:t xml:space="preserve">v2.5.1</w:t>
-      </w:r>
-      <w:r>
-        <w:t xml:space="preserve"> </w:t>
-      </w:r>
-      <w:r>
-        <w:t xml:space="preserve">·</w:t>
-      </w:r>
-      <w:r>
-        <w:t xml:space="preserve"> </w:t>
-      </w:r>
-      <w:r>
-        <w:rPr>
-          <w:rStyle w:val="VerbatimChar"/>
-        </w:rPr>
-        <w:t xml:space="preserve">10.5281/zenodo.20417136</w:t>
-      </w:r>
-      <w:r>
-        <w:t xml:space="preserve"> </w:t>
-      </w:r>
-      <w:r>
-        <w:t xml:space="preserve">·</w:t>
-      </w:r>
-      <w:r>
-        <w:t xml:space="preserve"> </w:t>
-      </w:r>
-      <w:r>
-        <w:rPr>
-          <w:rStyle w:val="VerbatimChar"/>
-        </w:rPr>
-        <w:t xml:space="preserve">33ceeb67…</w:t>
+          <w:i/>
+          <w:iCs/>
+        </w:rPr>
+        <w:t xml:space="preserve">No prior releases.</w:t>
       </w:r>
     </w:p>
     <w:bookmarkStart w:id="145" w:name="refs"/>

</xml_diff>

<commit_message>
fix(template): restore validation pipeline
</commit_message>
<xml_diff>
--- a/output/templates/template_code_project/docx/templates/template_code_project_combined.docx
+++ b/output/templates/template_code_project/docx/templates/template_code_project_combined.docx
@@ -12856,7 +12856,7 @@
         <w:t xml:space="preserve">Generated</w:t>
       </w:r>
       <w:r>
-        <w:t xml:space="preserve">: 2026-06-30T12:08:00Z</w:t>
+        <w:t xml:space="preserve">: 2026-07-08T02:12:25Z</w:t>
       </w:r>
     </w:p>
     <w:bookmarkEnd w:id="110"/>
@@ -12898,7 +12898,7 @@
         <w:rPr>
           <w:rStyle w:val="VerbatimChar"/>
         </w:rPr>
-        <w:t xml:space="preserve">scripts/02_run_analysis.py</w:t>
+        <w:t xml:space="preserve">scripts/pipeline/stage_02_analysis.py</w:t>
       </w:r>
       <w:r>
         <w:t xml:space="preserve"> </w:t>
@@ -13497,7 +13497,7 @@
               <w:rPr>
                 <w:rStyle w:val="VerbatimChar"/>
               </w:rPr>
-              <w:t xml:space="preserve">16947a5b0d7990e2</w:t>
+              <w:t xml:space="preserve">7182b437c586a680</w:t>
             </w:r>
           </w:p>
         </w:tc>

</xml_diff>

<commit_message>
fix(ci): harden Python 3.10 and publication output preservation
</commit_message>
<xml_diff>
--- a/output/templates/template_code_project/docx/templates/template_code_project_combined.docx
+++ b/output/templates/template_code_project/docx/templates/template_code_project_combined.docx
@@ -1606,7 +1606,7 @@
         <w:t xml:space="preserve"> </w:t>
       </w:r>
       <w:r>
-        <w:t xml:space="preserve">to guarantee numerical boundaries and performance scaling.</w:t>
+        <w:t xml:space="preserve">to check numerical boundaries and exercise runtime performance diagnostics without pinning host-dependent timings.</w:t>
       </w:r>
     </w:p>
     <w:p>
@@ -3182,7 +3182,7 @@
         <w:pStyle w:val="FirstParagraph"/>
       </w:pPr>
       <w:r>
-        <w:t xml:space="preserve">Computational complexity is evaluated not just theoretically, but empirically via</w:t>
+        <w:t xml:space="preserve">The analysis exercises</w:t>
       </w:r>
       <w:r>
         <w:t xml:space="preserve"> </w:t>
@@ -3196,36 +3196,34 @@
         </w:r>
       </w:hyperlink>
       <w:r>
-        <w:t xml:space="preserve">. This module captures high-resolution execution timings and memory footprints across dimensionality sweeps, guaranteeing that the</w:t>
-      </w:r>
-      <w:r>
-        <w:t xml:space="preserve"> </w:t>
-      </w:r>
-      <m:oMath>
-        <m:r>
-          <m:t>O</m:t>
-        </m:r>
-        <m:r>
-          <m:rPr>
-            <m:sty m:val="p"/>
-          </m:rPr>
-          <m:t>(</m:t>
-        </m:r>
-        <m:r>
-          <m:t>n</m:t>
-        </m:r>
-        <m:r>
-          <m:rPr>
-            <m:sty m:val="p"/>
-          </m:rPr>
-          <m:t>)</m:t>
-        </m:r>
-      </m:oMath>
-      <w:r>
-        <w:t xml:space="preserve"> </w:t>
-      </w:r>
-      <w:r>
-        <w:t xml:space="preserve">space-time complexity predictions hold true on the host architecture.</w:t>
+        <w:t xml:space="preserve"> </w:t>
+      </w:r>
+      <w:r>
+        <w:t xml:space="preserve">as a runtime diagnostic. Host-dependent timing and memory observations are logged but excluded from tracked evidence. The canonical report records fixed inputs and exact objective values, while the dimensional figure reports deterministic convergence iterations and the proxy</w:t>
+      </w:r>
+      <w:r>
+        <w:t xml:space="preserve"> </w:t>
+      </w:r>
+      <m:oMath>
+        <m:r>
+          <m:t>d</m:t>
+        </m:r>
+        <m:r>
+          <m:rPr>
+            <m:sty m:val="p"/>
+          </m:rPr>
+          <m:t>×</m:t>
+        </m:r>
+        <m:r>
+          <m:rPr>
+            <m:nor/>
+            <m:sty m:val="p"/>
+          </m:rPr>
+          <m:t>iterations</m:t>
+        </m:r>
+      </m:oMath>
+      <w:r>
+        <w:t xml:space="preserve">; neither surface claims that one host run proves an asymptotic bound.</w:t>
       </w:r>
     </w:p>
     <w:bookmarkEnd w:id="36"/>
@@ -9596,7 +9594,7 @@
         <w:pStyle w:val="FirstParagraph"/>
       </w:pPr>
       <w:r>
-        <w:t xml:space="preserve">fig. 5 shows how</w:t>
+        <w:t xml:space="preserve">fig. 5 shows deterministic computational work and convergence iterations for</w:t>
       </w:r>
       <w:r>
         <w:t xml:space="preserve"> </w:t>
@@ -9611,7 +9609,7 @@
         <w:t xml:space="preserve"> </w:t>
       </w:r>
       <w:r>
-        <w:t xml:space="preserve">scales with problem dimension by running the optimizer on identity-Hessian quadratics of dimension</w:t>
+        <w:t xml:space="preserve">on identity-Hessian quadratics of dimension</w:t>
       </w:r>
       <w:r>
         <w:t xml:space="preserve"> </w:t>
@@ -9701,7 +9699,7 @@
           <wp:inline>
             <wp:extent cx="5334000" cy="2251305"/>
             <wp:effectExtent b="0" l="0" r="0" t="0"/>
-            <wp:docPr descr="Figure 5: Dimensional scaling from generate_benchmark_visualization(). Dimensions d \in \{1, 2, 5, 10, 20, 50\} run on identity-Hessian quadratics with \alpha=0.1 and gradient tolerance 10^{-10} (both hardcoded in the script for benchmark stability). Left: mean wall-clock time per gradient_descent() call (μs). The flat regime at d \leq 20 reflects per-iteration overhead (Python dispatch, NumPy bookkeeping); the upturn at d=50 shows the O(d) matrix-vector cost beginning to dominate. Right: iterations-to-convergence rises only modestly across two decades of d (219 \to 238). This near-invariance is expected: \kappa(I_d)=1 regardless of dimension, so the contraction factor \rho=|1-\alpha|=0.9 is identical for every d, and only the per-coordinate residual norm grows mildly." title="" id="83" name="Picture"/>
+            <wp:docPr descr="Figure 5: Deterministic dimensional benchmark from generate_benchmark_visualization(). Dimensions d \in \{1, 2, 5, 10, 20, 50\} run on identity-Hessian quadratics with \alpha=0.1 and gradient tolerance 10^{-10}. Left: the implementation-independent work proxy d \times \text{iterations}, proportional to scalar elements processed by the dense matrix-vector update. Right: exact iterations to convergence. Wall-clock microseconds are intentionally excluded because they vary with hardware and host load. The similar iteration counts are expected because \kappa(I_d)=1 and the contraction factor \rho=|1-\alpha|=0.9 is dimension-independent." title="" id="83" name="Picture"/>
             <a:graphic>
               <a:graphicData uri="http://schemas.openxmlformats.org/drawingml/2006/picture">
                 <pic:pic>
@@ -9744,7 +9742,7 @@
         <w:pStyle w:val="ImageCaption"/>
       </w:pPr>
       <w:r>
-        <w:t xml:space="preserve">Figure 5: Dimensional scaling from</w:t>
+        <w:t xml:space="preserve">Figure 5: Deterministic dimensional benchmark from</w:t>
       </w:r>
       <w:r>
         <w:t xml:space="preserve"> </w:t>
@@ -9885,10 +9883,7 @@
         </m:sSup>
       </m:oMath>
       <w:r>
-        <w:t xml:space="preserve"> </w:t>
-      </w:r>
-      <w:r>
-        <w:t xml:space="preserve">(both hardcoded in the script for benchmark stability).</w:t>
+        <w:t xml:space="preserve">.</w:t>
       </w:r>
       <w:r>
         <w:t xml:space="preserve"> </w:t>
@@ -9901,22 +9896,7 @@
         <w:t xml:space="preserve">Left</w:t>
       </w:r>
       <w:r>
-        <w:t xml:space="preserve">: mean wall-clock time per</w:t>
-      </w:r>
-      <w:r>
-        <w:t xml:space="preserve"> </w:t>
-      </w:r>
-      <w:r>
-        <w:rPr>
-          <w:rStyle w:val="VerbatimChar"/>
-        </w:rPr>
-        <w:t xml:space="preserve">gradient_descent()</w:t>
-      </w:r>
-      <w:r>
-        <w:t xml:space="preserve"> </w:t>
-      </w:r>
-      <w:r>
-        <w:t xml:space="preserve">call (μs). The flat regime at</w:t>
+        <w:t xml:space="preserve">: the implementation-independent work proxy</w:t>
       </w:r>
       <w:r>
         <w:t xml:space="preserve"> </w:t>
@@ -9929,69 +9909,18 @@
           <m:rPr>
             <m:sty m:val="p"/>
           </m:rPr>
-          <m:t>≤</m:t>
-        </m:r>
-        <m:r>
-          <m:t>20</m:t>
-        </m:r>
-      </m:oMath>
-      <w:r>
-        <w:t xml:space="preserve"> </w:t>
-      </w:r>
-      <w:r>
-        <w:t xml:space="preserve">reflects per-iteration overhead (Python dispatch, NumPy bookkeeping); the upturn at</w:t>
-      </w:r>
-      <w:r>
-        <w:t xml:space="preserve"> </w:t>
-      </w:r>
-      <m:oMath>
-        <m:r>
-          <m:t>d</m:t>
-        </m:r>
-        <m:r>
-          <m:rPr>
-            <m:sty m:val="p"/>
-          </m:rPr>
-          <m:t>=</m:t>
-        </m:r>
-        <m:r>
-          <m:t>50</m:t>
-        </m:r>
-      </m:oMath>
-      <w:r>
-        <w:t xml:space="preserve"> </w:t>
-      </w:r>
-      <w:r>
-        <w:t xml:space="preserve">shows the</w:t>
-      </w:r>
-      <w:r>
-        <w:t xml:space="preserve"> </w:t>
-      </w:r>
-      <m:oMath>
-        <m:r>
-          <m:t>O</m:t>
-        </m:r>
-        <m:r>
-          <m:rPr>
-            <m:sty m:val="p"/>
-          </m:rPr>
-          <m:t>(</m:t>
-        </m:r>
-        <m:r>
-          <m:t>d</m:t>
-        </m:r>
-        <m:r>
-          <m:rPr>
-            <m:sty m:val="p"/>
-          </m:rPr>
-          <m:t>)</m:t>
-        </m:r>
-      </m:oMath>
-      <w:r>
-        <w:t xml:space="preserve"> </w:t>
-      </w:r>
-      <w:r>
-        <w:t xml:space="preserve">matrix-vector cost beginning to dominate.</w:t>
+          <m:t>×</m:t>
+        </m:r>
+        <m:r>
+          <m:rPr>
+            <m:nor/>
+            <m:sty m:val="p"/>
+          </m:rPr>
+          <m:t>iterations</m:t>
+        </m:r>
+      </m:oMath>
+      <w:r>
+        <w:t xml:space="preserve">, proportional to scalar elements processed by the dense matrix-vector update.</w:t>
       </w:r>
       <w:r>
         <w:t xml:space="preserve"> </w:t>
@@ -10004,38 +9933,7 @@
         <w:t xml:space="preserve">Right</w:t>
       </w:r>
       <w:r>
-        <w:t xml:space="preserve">: iterations-to-convergence rises only modestly across two decades of</w:t>
-      </w:r>
-      <w:r>
-        <w:t xml:space="preserve"> </w:t>
-      </w:r>
-      <m:oMath>
-        <m:r>
-          <m:t>d</m:t>
-        </m:r>
-      </m:oMath>
-      <w:r>
-        <w:t xml:space="preserve"> </w:t>
-      </w:r>
-      <w:r>
-        <w:t xml:space="preserve">(</w:t>
-      </w:r>
-      <m:oMath>
-        <m:r>
-          <m:t>219</m:t>
-        </m:r>
-        <m:r>
-          <m:rPr>
-            <m:sty m:val="p"/>
-          </m:rPr>
-          <m:t>→</m:t>
-        </m:r>
-        <m:r>
-          <m:t>238</m:t>
-        </m:r>
-      </m:oMath>
-      <w:r>
-        <w:t xml:space="preserve">). This near-invariance is expected:</w:t>
+        <w:t xml:space="preserve">: exact iterations to convergence. Wall-clock microseconds are intentionally excluded because they vary with hardware and host load. The similar iteration counts are expected because</w:t>
       </w:r>
       <w:r>
         <w:t xml:space="preserve"> </w:t>
@@ -10082,7 +9980,7 @@
         <w:t xml:space="preserve"> </w:t>
       </w:r>
       <w:r>
-        <w:t xml:space="preserve">regardless of dimension, so the contraction factor</w:t>
+        <w:t xml:space="preserve">and the contraction factor</w:t>
       </w:r>
       <w:r>
         <w:t xml:space="preserve"> </w:t>
@@ -10135,18 +10033,7 @@
         <w:t xml:space="preserve"> </w:t>
       </w:r>
       <w:r>
-        <w:t xml:space="preserve">is identical for every</w:t>
-      </w:r>
-      <w:r>
-        <w:t xml:space="preserve"> </w:t>
-      </w:r>
-      <m:oMath>
-        <m:r>
-          <m:t>d</m:t>
-        </m:r>
-      </m:oMath>
-      <w:r>
-        <w:t xml:space="preserve">, and only the per-coordinate residual norm grows mildly.</w:t>
+        <w:t xml:space="preserve">is dimension-independent.</w:t>
       </w:r>
     </w:p>
     <w:bookmarkEnd w:id="85"/>
@@ -12742,23 +12629,7 @@
         </m:r>
       </m:oMath>
       <w:r>
-        <w:t xml:space="preserve">), using identity-Hessian quadratics to isolate algorithmic scaling from problem conditioning effects. Representative single-call execution time from the last benchmark run:</w:t>
-      </w:r>
-      <w:r>
-        <w:t xml:space="preserve"> </w:t>
-      </w:r>
-      <w:r>
-        <w:rPr>
-          <w:b/>
-          <w:bCs/>
-        </w:rPr>
-        <w:t xml:space="preserve">1.9 μs</w:t>
-      </w:r>
-      <w:r>
-        <w:t xml:space="preserve"> </w:t>
-      </w:r>
-      <w:r>
-        <w:t xml:space="preserve">(recorded in</w:t>
+        <w:t xml:space="preserve">), using identity-Hessian quadratics to isolate algorithmic scaling from problem conditioning effects. The tracked</w:t>
       </w:r>
       <w:r>
         <w:t xml:space="preserve"> </w:t>
@@ -12770,7 +12641,10 @@
         <w:t xml:space="preserve">output/reports/performance_benchmark.json</w:t>
       </w:r>
       <w:r>
-        <w:t xml:space="preserve">).</w:t>
+        <w:t xml:space="preserve"> </w:t>
+      </w:r>
+      <w:r>
+        <w:t xml:space="preserve">records fixed inputs, exact objective values, and validation checks. Wall-clock timing is retained only as a runtime diagnostic because host load and hardware make microsecond values unsuitable as pinned reproducibility claims.</w:t>
       </w:r>
     </w:p>
     <w:bookmarkEnd w:id="109"/>
@@ -12856,7 +12730,7 @@
         <w:t xml:space="preserve">Generated</w:t>
       </w:r>
       <w:r>
-        <w:t xml:space="preserve">: 2026-07-08T02:12:25Z</w:t>
+        <w:t xml:space="preserve">: 2026-07-12T04:04:24Z</w:t>
       </w:r>
     </w:p>
     <w:bookmarkEnd w:id="110"/>
@@ -13497,7 +13371,7 @@
               <w:rPr>
                 <w:rStyle w:val="VerbatimChar"/>
               </w:rPr>
-              <w:t xml:space="preserve">7182b437c586a680</w:t>
+              <w:t xml:space="preserve">292643985e5af3f2</w:t>
             </w:r>
           </w:p>
         </w:tc>
@@ -13684,7 +13558,7 @@
               <w:pStyle w:val="Compact"/>
             </w:pPr>
             <w:r>
-              <w:t xml:space="preserve">8</w:t>
+              <w:t xml:space="preserve">9</w:t>
             </w:r>
           </w:p>
         </w:tc>
@@ -13732,7 +13606,7 @@
               <w:pStyle w:val="Compact"/>
             </w:pPr>
             <w:r>
-              <w:t xml:space="preserve">9</w:t>
+              <w:t xml:space="preserve">19</w:t>
             </w:r>
           </w:p>
         </w:tc>
@@ -13764,7 +13638,7 @@
                 <w:b/>
                 <w:bCs/>
               </w:rPr>
-              <w:t xml:space="preserve">22</w:t>
+              <w:t xml:space="preserve">33</w:t>
             </w:r>
           </w:p>
         </w:tc>
@@ -14096,7 +13970,7 @@
         <w:t xml:space="preserve">src/benchmark_support.py</w:t>
       </w:r>
       <w:r>
-        <w:t xml:space="preserve">, which times the pure</w:t>
+        <w:t xml:space="preserve">, which evaluates the pure</w:t>
       </w:r>
       <w:r>
         <w:t xml:space="preserve"> </w:t>
@@ -14111,7 +13985,7 @@
         <w:t xml:space="preserve"> </w:t>
       </w:r>
       <w:r>
-        <w:t xml:space="preserve">across a fixed set of input sizes (deterministic seed, no network) and turns the timing facts into boolean rubric checks. Those checks are scored through the shared</w:t>
+        <w:t xml:space="preserve">across fixed seeded inputs and turns reproducible completion, finiteness, and output-stability facts into boolean rubric checks. Those checks are scored through</w:t>
       </w:r>
       <w:r>
         <w:t xml:space="preserve"> </w:t>
@@ -14138,7 +14012,7 @@
         <w:t xml:space="preserve">RubricSet</w:t>
       </w:r>
       <w:r>
-        <w:t xml:space="preserve">, and the result is rendered with</w:t>
+        <w:t xml:space="preserve">, then rendered with</w:t>
       </w:r>
       <w:r>
         <w:t xml:space="preserve"> </w:t>
@@ -14153,7 +14027,7 @@
         <w:t xml:space="preserve"> </w:t>
       </w:r>
       <w:r>
-        <w:t xml:space="preserve">into</w:t>
+        <w:t xml:space="preserve">into the byte-stable</w:t>
       </w:r>
       <w:r>
         <w:t xml:space="preserve"> </w:t>
@@ -14168,7 +14042,7 @@
         <w:t xml:space="preserve"> </w:t>
       </w:r>
       <w:r>
-        <w:t xml:space="preserve">(plus an optional timing figure). This keeps the benchmark API exercised by a real exemplar, not by infrastructure tests alone.</w:t>
+        <w:t xml:space="preserve">with a deterministic objective-value figure. Real timing still executes as a runtime diagnostic, but it is not serialized into tracked evidence.</w:t>
       </w:r>
     </w:p>
     <w:bookmarkEnd w:id="118"/>

</xml_diff>